<commit_message>
Fix: simplifica plantilla (saca portada del cuadro de texto flotante) y usa solo getParagraphs(), sin XmlCursor. Nuevo formato de titulo de semana.
</commit_message>
<xml_diff>
--- a/src/main/resources/plantillas/Informe_Pasantia_Plantilla.docx
+++ b/src/main/resources/plantillas/Informe_Pasantia_Plantilla.docx
@@ -477,643 +477,280 @@
     </w:p>
     <w:p>
       <w:pPr>
-        <w:rPr>
+        <w:spacing w:line="360" w:lineRule="auto"/>
+        <w:rPr>
+          <w:rFonts w:ascii="Arial" w:hAnsi="Arial" w:cs="Arial"/>
+          <w:color w:val="000000" w:themeColor="text1"/>
+          <w:sz w:val="28"/>
+          <w:szCs w:val="28"/>
+        </w:rPr>
+      </w:pPr>
+      <w:bookmarkStart w:id="0" w:name="alumno"/>
+      <w:r>
+        <w:rPr>
+          <w:rFonts w:ascii="Arial" w:hAnsi="Arial" w:cs="Arial"/>
+          <w:color w:val="000000" w:themeColor="text1"/>
+          <w:sz w:val="28"/>
+          <w:szCs w:val="28"/>
           <w:lang w:val="es-ES"/>
         </w:rPr>
-      </w:pPr>
-      <w:r>
-        <w:rPr>
-          <w:noProof/>
+        <w:t>Alumn</w:t>
+      </w:r>
+      <w:r>
+        <w:rPr>
+          <w:rFonts w:ascii="Arial" w:hAnsi="Arial" w:cs="Arial"/>
+          <w:color w:val="000000" w:themeColor="text1"/>
+          <w:sz w:val="28"/>
+          <w:szCs w:val="28"/>
           <w:lang w:val="es-ES"/>
         </w:rPr>
-        <mc:AlternateContent>
-          <mc:Choice Requires="wps">
-            <w:drawing>
-              <wp:anchor distT="45720" distB="45720" distL="114300" distR="114300" simplePos="0" relativeHeight="251665408" behindDoc="0" locked="0" layoutInCell="1" allowOverlap="1" wp14:anchorId="37DC5801" wp14:editId="5615F534">
-                <wp:simplePos x="0" y="0"/>
-                <wp:positionH relativeFrom="margin">
-                  <wp:align>left</wp:align>
-                </wp:positionH>
-                <wp:positionV relativeFrom="paragraph">
-                  <wp:posOffset>528320</wp:posOffset>
-                </wp:positionV>
-                <wp:extent cx="5577840" cy="3246120"/>
-                <wp:effectExtent l="0" t="0" r="3810" b="0"/>
-                <wp:wrapSquare wrapText="bothSides"/>
-                <wp:docPr id="1741385055" name="Cuadro de texto 2"/>
-                <wp:cNvGraphicFramePr>
-                  <a:graphicFrameLocks xmlns:a="http://schemas.openxmlformats.org/drawingml/2006/main"/>
-                </wp:cNvGraphicFramePr>
-                <a:graphic xmlns:a="http://schemas.openxmlformats.org/drawingml/2006/main">
-                  <a:graphicData uri="http://schemas.microsoft.com/office/word/2010/wordprocessingShape">
-                    <wps:wsp>
-                      <wps:cNvSpPr txBox="1">
-                        <a:spLocks noChangeArrowheads="1"/>
-                      </wps:cNvSpPr>
-                      <wps:spPr bwMode="auto">
-                        <a:xfrm>
-                          <a:off x="0" y="0"/>
-                          <a:ext cx="5577840" cy="3246120"/>
-                        </a:xfrm>
-                        <a:prstGeom prst="rect">
-                          <a:avLst/>
-                        </a:prstGeom>
-                        <a:solidFill>
-                          <a:srgbClr val="FFFFFF"/>
-                        </a:solidFill>
-                        <a:ln w="9525">
-                          <a:noFill/>
-                          <a:miter lim="800000"/>
-                          <a:headEnd/>
-                          <a:tailEnd/>
-                        </a:ln>
-                      </wps:spPr>
-                      <wps:txbx>
-                        <w:txbxContent>
-                          <w:p>
-                            <w:pPr>
-                              <w:spacing w:line="360" w:lineRule="auto"/>
-                              <w:rPr>
-                                <w:rFonts w:ascii="Arial" w:hAnsi="Arial" w:cs="Arial"/>
-                                <w:color w:val="000000" w:themeColor="text1"/>
-                                <w:sz w:val="28"/>
-                                <w:szCs w:val="28"/>
-                              </w:rPr>
-                            </w:pPr>
-                            <w:bookmarkStart w:id="0" w:name="alumno"/>
-                            <w:r>
-                              <w:rPr>
-                                <w:rFonts w:ascii="Arial" w:hAnsi="Arial" w:cs="Arial"/>
-                                <w:color w:val="000000" w:themeColor="text1"/>
-                                <w:sz w:val="28"/>
-                                <w:szCs w:val="28"/>
-                                <w:lang w:val="es-ES"/>
-                              </w:rPr>
-                              <w:t>Alumn</w:t>
-                            </w:r>
-                            <w:r>
-                              <w:rPr>
-                                <w:rFonts w:ascii="Arial" w:hAnsi="Arial" w:cs="Arial"/>
-                                <w:color w:val="000000" w:themeColor="text1"/>
-                                <w:sz w:val="28"/>
-                                <w:szCs w:val="28"/>
-                                <w:lang w:val="es-ES"/>
-                              </w:rPr>
-                              <w:t>o</w:t>
-                            </w:r>
-                            <w:r>
-                              <w:rPr>
-                                <w:rFonts w:ascii="Arial" w:hAnsi="Arial" w:cs="Arial"/>
-                                <w:color w:val="000000" w:themeColor="text1"/>
-                                <w:sz w:val="28"/>
-                                <w:szCs w:val="28"/>
-                                <w:lang w:val="es-ES"/>
-                              </w:rPr>
-                              <w:t xml:space="preserve">: </w:t>
-                            </w:r>
-                            <w:r>
-                              <w:rPr>
-                                <w:rFonts w:ascii="Arial" w:hAnsi="Arial" w:cs="Arial"/>
-                                <w:color w:val="000000" w:themeColor="text1"/>
-                                <w:sz w:val="28"/>
-                                <w:szCs w:val="28"/>
-                              </w:rPr>
-                              <w:t>Alumno</w:t>
-                            </w:r>
-                            <w:bookmarkEnd w:id="0"/>
-                          </w:p>
-                          <w:p>
-                            <w:pPr>
-                              <w:spacing w:line="360" w:lineRule="auto"/>
-                              <w:rPr>
-                                <w:rFonts w:ascii="Arial" w:hAnsi="Arial" w:cs="Arial"/>
-                                <w:color w:val="000000" w:themeColor="text1"/>
-                                <w:sz w:val="28"/>
-                                <w:szCs w:val="28"/>
-                              </w:rPr>
-                            </w:pPr>
-                            <w:r>
-                              <w:rPr>
-                                <w:rFonts w:ascii="Arial" w:hAnsi="Arial" w:cs="Arial"/>
-                                <w:color w:val="000000" w:themeColor="text1"/>
-                                <w:sz w:val="28"/>
-                                <w:szCs w:val="28"/>
-                              </w:rPr>
-                              <w:t xml:space="preserve">Curso: </w:t>
-                            </w:r>
-                            <w:bookmarkStart w:id="1" w:name="curso"/>
-                            <w:r>
-                              <w:rPr>
-                                <w:rFonts w:ascii="Arial" w:hAnsi="Arial" w:cs="Arial"/>
-                                <w:color w:val="000000" w:themeColor="text1"/>
-                                <w:sz w:val="28"/>
-                                <w:szCs w:val="28"/>
-                              </w:rPr>
-                              <w:t>Curso</w:t>
-                            </w:r>
-                            <w:bookmarkEnd w:id="1"/>
-                          </w:p>
-                          <w:p>
-                            <w:pPr>
-                              <w:spacing w:line="360" w:lineRule="auto"/>
-                              <w:rPr>
-                                <w:rFonts w:ascii="Arial" w:hAnsi="Arial" w:cs="Arial"/>
-                                <w:color w:val="000000" w:themeColor="text1"/>
-                                <w:sz w:val="28"/>
-                                <w:szCs w:val="28"/>
-                              </w:rPr>
-                            </w:pPr>
-                            <w:r>
-                              <w:rPr>
-                                <w:rFonts w:ascii="Arial" w:hAnsi="Arial" w:cs="Arial"/>
-                                <w:color w:val="000000" w:themeColor="text1"/>
-                                <w:sz w:val="28"/>
-                                <w:szCs w:val="28"/>
-                              </w:rPr>
-                              <w:t>Tu</w:t>
-                            </w:r>
-                            <w:r>
-                              <w:rPr>
-                                <w:rFonts w:ascii="Arial" w:hAnsi="Arial" w:cs="Arial"/>
-                                <w:color w:val="000000" w:themeColor="text1"/>
-                                <w:sz w:val="28"/>
-                                <w:szCs w:val="28"/>
-                              </w:rPr>
-                              <w:t>rn</w:t>
-                            </w:r>
-                            <w:r>
-                              <w:rPr>
-                                <w:rFonts w:ascii="Arial" w:hAnsi="Arial" w:cs="Arial"/>
-                                <w:color w:val="000000" w:themeColor="text1"/>
-                                <w:sz w:val="28"/>
-                                <w:szCs w:val="28"/>
-                              </w:rPr>
-                              <w:t xml:space="preserve">o: </w:t>
-                            </w:r>
-                            <w:bookmarkStart w:id="2" w:name="turno"/>
-                            <w:r>
-                              <w:rPr>
-                                <w:rFonts w:ascii="Arial" w:hAnsi="Arial" w:cs="Arial"/>
-                                <w:color w:val="000000" w:themeColor="text1"/>
-                                <w:sz w:val="28"/>
-                                <w:szCs w:val="28"/>
-                              </w:rPr>
-                              <w:t>Turno</w:t>
-                            </w:r>
-                            <w:bookmarkEnd w:id="2"/>
-                          </w:p>
-                          <w:p>
-                            <w:pPr>
-                              <w:spacing w:line="360" w:lineRule="auto"/>
-                              <w:rPr>
-                                <w:rFonts w:ascii="Arial" w:hAnsi="Arial" w:cs="Arial"/>
-                                <w:color w:val="000000" w:themeColor="text1"/>
-                                <w:sz w:val="28"/>
-                                <w:szCs w:val="28"/>
-                              </w:rPr>
-                            </w:pPr>
-                            <w:r>
-                              <w:rPr>
-                                <w:rFonts w:ascii="Arial" w:hAnsi="Arial" w:cs="Arial"/>
-                                <w:color w:val="000000" w:themeColor="text1"/>
-                                <w:sz w:val="28"/>
-                                <w:szCs w:val="28"/>
-                              </w:rPr>
-                              <w:t xml:space="preserve">Especialidad: </w:t>
-                            </w:r>
-                            <w:bookmarkStart w:id="3" w:name="especialidad"/>
-                            <w:r>
-                              <w:rPr>
-                                <w:rFonts w:ascii="Arial" w:hAnsi="Arial" w:cs="Arial"/>
-                                <w:color w:val="000000" w:themeColor="text1"/>
-                                <w:sz w:val="28"/>
-                                <w:szCs w:val="28"/>
-                              </w:rPr>
-                              <w:t>Especialidad</w:t>
-                            </w:r>
-                            <w:bookmarkEnd w:id="3"/>
-                          </w:p>
-                          <w:p>
-                            <w:pPr>
-                              <w:spacing w:line="360" w:lineRule="auto"/>
-                              <w:rPr>
-                                <w:rFonts w:ascii="Arial" w:hAnsi="Arial" w:cs="Arial"/>
-                                <w:color w:val="000000" w:themeColor="text1"/>
-                                <w:sz w:val="28"/>
-                                <w:szCs w:val="28"/>
-                              </w:rPr>
-                            </w:pPr>
-                            <w:r>
-                              <w:rPr>
-                                <w:rFonts w:ascii="Arial" w:hAnsi="Arial" w:cs="Arial"/>
-                                <w:color w:val="000000" w:themeColor="text1"/>
-                                <w:sz w:val="28"/>
-                                <w:szCs w:val="28"/>
-                              </w:rPr>
-                              <w:t xml:space="preserve">Empresa: </w:t>
-                            </w:r>
-                            <w:bookmarkStart w:id="4" w:name="empresa"/>
-                            <w:r>
-                              <w:rPr>
-                                <w:rFonts w:ascii="Arial" w:hAnsi="Arial" w:cs="Arial"/>
-                                <w:color w:val="000000" w:themeColor="text1"/>
-                                <w:sz w:val="28"/>
-                                <w:szCs w:val="28"/>
-                              </w:rPr>
-                              <w:t>Empresa</w:t>
-                            </w:r>
-                            <w:bookmarkEnd w:id="4"/>
-                          </w:p>
-                          <w:p>
-                            <w:pPr>
-                              <w:spacing w:line="360" w:lineRule="auto"/>
-                              <w:rPr>
-                                <w:rFonts w:ascii="Arial" w:hAnsi="Arial" w:cs="Arial"/>
-                                <w:color w:val="000000" w:themeColor="text1"/>
-                                <w:sz w:val="28"/>
-                                <w:szCs w:val="28"/>
-                              </w:rPr>
-                            </w:pPr>
-                            <w:r>
-                              <w:rPr>
-                                <w:rFonts w:ascii="Arial" w:hAnsi="Arial" w:cs="Arial"/>
-                                <w:color w:val="000000" w:themeColor="text1"/>
-                                <w:sz w:val="28"/>
-                                <w:szCs w:val="28"/>
-                              </w:rPr>
-                              <w:t>Coordinador de pasantía: Ing. Luis Codas</w:t>
-                            </w:r>
-                          </w:p>
-                          <w:p>
-                            <w:pPr>
-                              <w:spacing w:line="360" w:lineRule="auto"/>
-                              <w:rPr>
-                                <w:rFonts w:ascii="Arial" w:hAnsi="Arial" w:cs="Arial"/>
-                                <w:color w:val="000000" w:themeColor="text1"/>
-                                <w:sz w:val="28"/>
-                                <w:szCs w:val="28"/>
-                              </w:rPr>
-                            </w:pPr>
-                            <w:r>
-                              <w:rPr>
-                                <w:rFonts w:ascii="Arial" w:hAnsi="Arial" w:cs="Arial"/>
-                                <w:color w:val="000000" w:themeColor="text1"/>
-                                <w:sz w:val="28"/>
-                                <w:szCs w:val="28"/>
-                              </w:rPr>
-                              <w:t xml:space="preserve">Docente/Tutor: </w:t>
-                            </w:r>
-                            <w:bookmarkStart w:id="5" w:name="docente"/>
-                            <w:r>
-                              <w:rPr>
-                                <w:rFonts w:ascii="Arial" w:hAnsi="Arial" w:cs="Arial"/>
-                                <w:color w:val="000000" w:themeColor="text1"/>
-                                <w:sz w:val="28"/>
-                                <w:szCs w:val="28"/>
-                              </w:rPr>
-                              <w:t>Docente/Tutor</w:t>
-                            </w:r>
-                            <w:bookmarkEnd w:id="5"/>
-                          </w:p>
-                          <w:p>
-                            <w:pPr>
-                              <w:spacing w:line="360" w:lineRule="auto"/>
-                              <w:rPr>
-                                <w:rFonts w:ascii="Arial" w:hAnsi="Arial" w:cs="Arial"/>
-                                <w:color w:val="000000" w:themeColor="text1"/>
-                                <w:sz w:val="28"/>
-                                <w:szCs w:val="28"/>
-                                <w:lang w:val="es-ES"/>
-                              </w:rPr>
-                            </w:pPr>
-                            <w:r>
-                              <w:rPr>
-                                <w:rFonts w:ascii="Arial" w:hAnsi="Arial" w:cs="Arial"/>
-                                <w:color w:val="000000" w:themeColor="text1"/>
-                                <w:sz w:val="28"/>
-                                <w:szCs w:val="28"/>
-                              </w:rPr>
-                              <w:t xml:space="preserve">Tutor de pasantía: </w:t>
-                            </w:r>
-                            <w:bookmarkStart w:id="6" w:name="tutor_pasantia"/>
-                            <w:r>
-                              <w:rPr>
-                                <w:rFonts w:ascii="Arial" w:hAnsi="Arial" w:cs="Arial"/>
-                                <w:color w:val="000000" w:themeColor="text1"/>
-                                <w:sz w:val="28"/>
-                                <w:szCs w:val="28"/>
-                              </w:rPr>
-                              <w:t>Tutor de pasantía</w:t>
-                            </w:r>
-                            <w:bookmarkEnd w:id="6"/>
-                          </w:p>
-                        </w:txbxContent>
-                      </wps:txbx>
-                      <wps:bodyPr rot="0" vert="horz" wrap="square" lIns="91440" tIns="45720" rIns="91440" bIns="45720" anchor="t" anchorCtr="0">
-                        <a:noAutofit/>
-                      </wps:bodyPr>
-                    </wps:wsp>
-                  </a:graphicData>
-                </a:graphic>
-                <wp14:sizeRelH relativeFrom="margin">
-                  <wp14:pctWidth>0</wp14:pctWidth>
-                </wp14:sizeRelH>
-                <wp14:sizeRelV relativeFrom="margin">
-                  <wp14:pctHeight>0</wp14:pctHeight>
-                </wp14:sizeRelV>
-              </wp:anchor>
-            </w:drawing>
-          </mc:Choice>
-          <mc:Fallback>
-            <w:pict>
-              <v:shape w14:anchorId="37DC5801" id="_x0000_s1028" type="#_x0000_t202" style="position:absolute;margin-left:0;margin-top:41.6pt;width:439.2pt;height:255.6pt;z-index:251665408;visibility:visible;mso-wrap-style:square;mso-width-percent:0;mso-height-percent:0;mso-wrap-distance-left:9pt;mso-wrap-distance-top:3.6pt;mso-wrap-distance-right:9pt;mso-wrap-distance-bottom:3.6pt;mso-position-horizontal:left;mso-position-horizontal-relative:margin;mso-position-vertical:absolute;mso-position-vertical-relative:text;mso-width-percent:0;mso-height-percent:0;mso-width-relative:margin;mso-height-relative:margin;v-text-anchor:top" o:gfxdata="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" stroked="f">
-                <v:textbox>
-                  <w:txbxContent>
-                    <w:p>
-                      <w:pPr>
-                        <w:spacing w:line="360" w:lineRule="auto"/>
-                        <w:rPr>
-                          <w:rFonts w:ascii="Arial" w:hAnsi="Arial" w:cs="Arial"/>
-                          <w:color w:val="000000" w:themeColor="text1"/>
-                          <w:sz w:val="28"/>
-                          <w:szCs w:val="28"/>
-                        </w:rPr>
-                      </w:pPr>
-                      <w:bookmarkStart w:id="7" w:name="alumno"/>
-                      <w:r>
-                        <w:rPr>
-                          <w:rFonts w:ascii="Arial" w:hAnsi="Arial" w:cs="Arial"/>
-                          <w:color w:val="000000" w:themeColor="text1"/>
-                          <w:sz w:val="28"/>
-                          <w:szCs w:val="28"/>
-                          <w:lang w:val="es-ES"/>
-                        </w:rPr>
-                        <w:t>Alumn</w:t>
-                      </w:r>
-                      <w:r>
-                        <w:rPr>
-                          <w:rFonts w:ascii="Arial" w:hAnsi="Arial" w:cs="Arial"/>
-                          <w:color w:val="000000" w:themeColor="text1"/>
-                          <w:sz w:val="28"/>
-                          <w:szCs w:val="28"/>
-                          <w:lang w:val="es-ES"/>
-                        </w:rPr>
-                        <w:t>o</w:t>
-                      </w:r>
-                      <w:r>
-                        <w:rPr>
-                          <w:rFonts w:ascii="Arial" w:hAnsi="Arial" w:cs="Arial"/>
-                          <w:color w:val="000000" w:themeColor="text1"/>
-                          <w:sz w:val="28"/>
-                          <w:szCs w:val="28"/>
-                          <w:lang w:val="es-ES"/>
-                        </w:rPr>
-                        <w:t xml:space="preserve">: </w:t>
-                      </w:r>
-                      <w:r>
-                        <w:rPr>
-                          <w:rFonts w:ascii="Arial" w:hAnsi="Arial" w:cs="Arial"/>
-                          <w:color w:val="000000" w:themeColor="text1"/>
-                          <w:sz w:val="28"/>
-                          <w:szCs w:val="28"/>
-                        </w:rPr>
-                        <w:t>Alumno</w:t>
-                      </w:r>
-                      <w:bookmarkEnd w:id="7"/>
-                    </w:p>
-                    <w:p>
-                      <w:pPr>
-                        <w:spacing w:line="360" w:lineRule="auto"/>
-                        <w:rPr>
-                          <w:rFonts w:ascii="Arial" w:hAnsi="Arial" w:cs="Arial"/>
-                          <w:color w:val="000000" w:themeColor="text1"/>
-                          <w:sz w:val="28"/>
-                          <w:szCs w:val="28"/>
-                        </w:rPr>
-                      </w:pPr>
-                      <w:r>
-                        <w:rPr>
-                          <w:rFonts w:ascii="Arial" w:hAnsi="Arial" w:cs="Arial"/>
-                          <w:color w:val="000000" w:themeColor="text1"/>
-                          <w:sz w:val="28"/>
-                          <w:szCs w:val="28"/>
-                        </w:rPr>
-                        <w:t xml:space="preserve">Curso: </w:t>
-                      </w:r>
-                      <w:bookmarkStart w:id="8" w:name="curso"/>
-                      <w:r>
-                        <w:rPr>
-                          <w:rFonts w:ascii="Arial" w:hAnsi="Arial" w:cs="Arial"/>
-                          <w:color w:val="000000" w:themeColor="text1"/>
-                          <w:sz w:val="28"/>
-                          <w:szCs w:val="28"/>
-                        </w:rPr>
-                        <w:t>Curso</w:t>
-                      </w:r>
-                      <w:bookmarkEnd w:id="8"/>
-                    </w:p>
-                    <w:p>
-                      <w:pPr>
-                        <w:spacing w:line="360" w:lineRule="auto"/>
-                        <w:rPr>
-                          <w:rFonts w:ascii="Arial" w:hAnsi="Arial" w:cs="Arial"/>
-                          <w:color w:val="000000" w:themeColor="text1"/>
-                          <w:sz w:val="28"/>
-                          <w:szCs w:val="28"/>
-                        </w:rPr>
-                      </w:pPr>
-                      <w:r>
-                        <w:rPr>
-                          <w:rFonts w:ascii="Arial" w:hAnsi="Arial" w:cs="Arial"/>
-                          <w:color w:val="000000" w:themeColor="text1"/>
-                          <w:sz w:val="28"/>
-                          <w:szCs w:val="28"/>
-                        </w:rPr>
-                        <w:t>Tu</w:t>
-                      </w:r>
-                      <w:r>
-                        <w:rPr>
-                          <w:rFonts w:ascii="Arial" w:hAnsi="Arial" w:cs="Arial"/>
-                          <w:color w:val="000000" w:themeColor="text1"/>
-                          <w:sz w:val="28"/>
-                          <w:szCs w:val="28"/>
-                        </w:rPr>
-                        <w:t>rn</w:t>
-                      </w:r>
-                      <w:r>
-                        <w:rPr>
-                          <w:rFonts w:ascii="Arial" w:hAnsi="Arial" w:cs="Arial"/>
-                          <w:color w:val="000000" w:themeColor="text1"/>
-                          <w:sz w:val="28"/>
-                          <w:szCs w:val="28"/>
-                        </w:rPr>
-                        <w:t xml:space="preserve">o: </w:t>
-                      </w:r>
-                      <w:bookmarkStart w:id="9" w:name="turno"/>
-                      <w:r>
-                        <w:rPr>
-                          <w:rFonts w:ascii="Arial" w:hAnsi="Arial" w:cs="Arial"/>
-                          <w:color w:val="000000" w:themeColor="text1"/>
-                          <w:sz w:val="28"/>
-                          <w:szCs w:val="28"/>
-                        </w:rPr>
-                        <w:t>Turno</w:t>
-                      </w:r>
-                      <w:bookmarkEnd w:id="9"/>
-                    </w:p>
-                    <w:p>
-                      <w:pPr>
-                        <w:spacing w:line="360" w:lineRule="auto"/>
-                        <w:rPr>
-                          <w:rFonts w:ascii="Arial" w:hAnsi="Arial" w:cs="Arial"/>
-                          <w:color w:val="000000" w:themeColor="text1"/>
-                          <w:sz w:val="28"/>
-                          <w:szCs w:val="28"/>
-                        </w:rPr>
-                      </w:pPr>
-                      <w:r>
-                        <w:rPr>
-                          <w:rFonts w:ascii="Arial" w:hAnsi="Arial" w:cs="Arial"/>
-                          <w:color w:val="000000" w:themeColor="text1"/>
-                          <w:sz w:val="28"/>
-                          <w:szCs w:val="28"/>
-                        </w:rPr>
-                        <w:t xml:space="preserve">Especialidad: </w:t>
-                      </w:r>
-                      <w:bookmarkStart w:id="10" w:name="especialidad"/>
-                      <w:r>
-                        <w:rPr>
-                          <w:rFonts w:ascii="Arial" w:hAnsi="Arial" w:cs="Arial"/>
-                          <w:color w:val="000000" w:themeColor="text1"/>
-                          <w:sz w:val="28"/>
-                          <w:szCs w:val="28"/>
-                        </w:rPr>
-                        <w:t>Especialidad</w:t>
-                      </w:r>
-                      <w:bookmarkEnd w:id="10"/>
-                    </w:p>
-                    <w:p>
-                      <w:pPr>
-                        <w:spacing w:line="360" w:lineRule="auto"/>
-                        <w:rPr>
-                          <w:rFonts w:ascii="Arial" w:hAnsi="Arial" w:cs="Arial"/>
-                          <w:color w:val="000000" w:themeColor="text1"/>
-                          <w:sz w:val="28"/>
-                          <w:szCs w:val="28"/>
-                        </w:rPr>
-                      </w:pPr>
-                      <w:r>
-                        <w:rPr>
-                          <w:rFonts w:ascii="Arial" w:hAnsi="Arial" w:cs="Arial"/>
-                          <w:color w:val="000000" w:themeColor="text1"/>
-                          <w:sz w:val="28"/>
-                          <w:szCs w:val="28"/>
-                        </w:rPr>
-                        <w:t xml:space="preserve">Empresa: </w:t>
-                      </w:r>
-                      <w:bookmarkStart w:id="11" w:name="empresa"/>
-                      <w:r>
-                        <w:rPr>
-                          <w:rFonts w:ascii="Arial" w:hAnsi="Arial" w:cs="Arial"/>
-                          <w:color w:val="000000" w:themeColor="text1"/>
-                          <w:sz w:val="28"/>
-                          <w:szCs w:val="28"/>
-                        </w:rPr>
-                        <w:t>Empresa</w:t>
-                      </w:r>
-                      <w:bookmarkEnd w:id="11"/>
-                    </w:p>
-                    <w:p>
-                      <w:pPr>
-                        <w:spacing w:line="360" w:lineRule="auto"/>
-                        <w:rPr>
-                          <w:rFonts w:ascii="Arial" w:hAnsi="Arial" w:cs="Arial"/>
-                          <w:color w:val="000000" w:themeColor="text1"/>
-                          <w:sz w:val="28"/>
-                          <w:szCs w:val="28"/>
-                        </w:rPr>
-                      </w:pPr>
-                      <w:r>
-                        <w:rPr>
-                          <w:rFonts w:ascii="Arial" w:hAnsi="Arial" w:cs="Arial"/>
-                          <w:color w:val="000000" w:themeColor="text1"/>
-                          <w:sz w:val="28"/>
-                          <w:szCs w:val="28"/>
-                        </w:rPr>
-                        <w:t>Coordinador de pasantía: Ing. Luis Codas</w:t>
-                      </w:r>
-                    </w:p>
-                    <w:p>
-                      <w:pPr>
-                        <w:spacing w:line="360" w:lineRule="auto"/>
-                        <w:rPr>
-                          <w:rFonts w:ascii="Arial" w:hAnsi="Arial" w:cs="Arial"/>
-                          <w:color w:val="000000" w:themeColor="text1"/>
-                          <w:sz w:val="28"/>
-                          <w:szCs w:val="28"/>
-                        </w:rPr>
-                      </w:pPr>
-                      <w:r>
-                        <w:rPr>
-                          <w:rFonts w:ascii="Arial" w:hAnsi="Arial" w:cs="Arial"/>
-                          <w:color w:val="000000" w:themeColor="text1"/>
-                          <w:sz w:val="28"/>
-                          <w:szCs w:val="28"/>
-                        </w:rPr>
-                        <w:t xml:space="preserve">Docente/Tutor: </w:t>
-                      </w:r>
-                      <w:bookmarkStart w:id="12" w:name="docente"/>
-                      <w:r>
-                        <w:rPr>
-                          <w:rFonts w:ascii="Arial" w:hAnsi="Arial" w:cs="Arial"/>
-                          <w:color w:val="000000" w:themeColor="text1"/>
-                          <w:sz w:val="28"/>
-                          <w:szCs w:val="28"/>
-                        </w:rPr>
-                        <w:t>Docente/Tutor</w:t>
-                      </w:r>
-                      <w:bookmarkEnd w:id="12"/>
-                    </w:p>
-                    <w:p>
-                      <w:pPr>
-                        <w:spacing w:line="360" w:lineRule="auto"/>
-                        <w:rPr>
-                          <w:rFonts w:ascii="Arial" w:hAnsi="Arial" w:cs="Arial"/>
-                          <w:color w:val="000000" w:themeColor="text1"/>
-                          <w:sz w:val="28"/>
-                          <w:szCs w:val="28"/>
-                          <w:lang w:val="es-ES"/>
-                        </w:rPr>
-                      </w:pPr>
-                      <w:r>
-                        <w:rPr>
-                          <w:rFonts w:ascii="Arial" w:hAnsi="Arial" w:cs="Arial"/>
-                          <w:color w:val="000000" w:themeColor="text1"/>
-                          <w:sz w:val="28"/>
-                          <w:szCs w:val="28"/>
-                        </w:rPr>
-                        <w:t xml:space="preserve">Tutor de pasantía: </w:t>
-                      </w:r>
-                      <w:bookmarkStart w:id="13" w:name="tutor_pasantia"/>
-                      <w:r>
-                        <w:rPr>
-                          <w:rFonts w:ascii="Arial" w:hAnsi="Arial" w:cs="Arial"/>
-                          <w:color w:val="000000" w:themeColor="text1"/>
-                          <w:sz w:val="28"/>
-                          <w:szCs w:val="28"/>
-                        </w:rPr>
-                        <w:t>Tutor de pasantía</w:t>
-                      </w:r>
-                      <w:bookmarkEnd w:id="13"/>
-                    </w:p>
-                  </w:txbxContent>
-                </v:textbox>
-                <w10:wrap type="square" anchorx="margin"/>
-              </v:shape>
-            </w:pict>
-          </mc:Fallback>
-        </mc:AlternateContent>
-      </w:r>
+        <w:t>o</w:t>
+      </w:r>
+      <w:r>
+        <w:rPr>
+          <w:rFonts w:ascii="Arial" w:hAnsi="Arial" w:cs="Arial"/>
+          <w:color w:val="000000" w:themeColor="text1"/>
+          <w:sz w:val="28"/>
+          <w:szCs w:val="28"/>
+          <w:lang w:val="es-ES"/>
+        </w:rPr>
+        <w:t xml:space="preserve">: </w:t>
+      </w:r>
+      <w:r>
+        <w:rPr>
+          <w:rFonts w:ascii="Arial" w:hAnsi="Arial" w:cs="Arial"/>
+          <w:color w:val="000000" w:themeColor="text1"/>
+          <w:sz w:val="28"/>
+          <w:szCs w:val="28"/>
+        </w:rPr>
+        <w:t>Alumno</w:t>
+      </w:r>
+      <w:bookmarkEnd w:id="0"/>
+    </w:p>
+    <w:p>
+      <w:pPr>
+        <w:spacing w:line="360" w:lineRule="auto"/>
+        <w:rPr>
+          <w:rFonts w:ascii="Arial" w:hAnsi="Arial" w:cs="Arial"/>
+          <w:color w:val="000000" w:themeColor="text1"/>
+          <w:sz w:val="28"/>
+          <w:szCs w:val="28"/>
+        </w:rPr>
+      </w:pPr>
+      <w:r>
+        <w:rPr>
+          <w:rFonts w:ascii="Arial" w:hAnsi="Arial" w:cs="Arial"/>
+          <w:color w:val="000000" w:themeColor="text1"/>
+          <w:sz w:val="28"/>
+          <w:szCs w:val="28"/>
+        </w:rPr>
+        <w:t xml:space="preserve">Curso: </w:t>
+      </w:r>
+      <w:bookmarkStart w:id="1" w:name="curso"/>
+      <w:r>
+        <w:rPr>
+          <w:rFonts w:ascii="Arial" w:hAnsi="Arial" w:cs="Arial"/>
+          <w:color w:val="000000" w:themeColor="text1"/>
+          <w:sz w:val="28"/>
+          <w:szCs w:val="28"/>
+        </w:rPr>
+        <w:t>Curso</w:t>
+      </w:r>
+      <w:bookmarkEnd w:id="1"/>
+    </w:p>
+    <w:p>
+      <w:pPr>
+        <w:spacing w:line="360" w:lineRule="auto"/>
+        <w:rPr>
+          <w:rFonts w:ascii="Arial" w:hAnsi="Arial" w:cs="Arial"/>
+          <w:color w:val="000000" w:themeColor="text1"/>
+          <w:sz w:val="28"/>
+          <w:szCs w:val="28"/>
+        </w:rPr>
+      </w:pPr>
+      <w:r>
+        <w:rPr>
+          <w:rFonts w:ascii="Arial" w:hAnsi="Arial" w:cs="Arial"/>
+          <w:color w:val="000000" w:themeColor="text1"/>
+          <w:sz w:val="28"/>
+          <w:szCs w:val="28"/>
+        </w:rPr>
+        <w:t>Tu</w:t>
+      </w:r>
+      <w:r>
+        <w:rPr>
+          <w:rFonts w:ascii="Arial" w:hAnsi="Arial" w:cs="Arial"/>
+          <w:color w:val="000000" w:themeColor="text1"/>
+          <w:sz w:val="28"/>
+          <w:szCs w:val="28"/>
+        </w:rPr>
+        <w:t>rn</w:t>
+      </w:r>
+      <w:r>
+        <w:rPr>
+          <w:rFonts w:ascii="Arial" w:hAnsi="Arial" w:cs="Arial"/>
+          <w:color w:val="000000" w:themeColor="text1"/>
+          <w:sz w:val="28"/>
+          <w:szCs w:val="28"/>
+        </w:rPr>
+        <w:t xml:space="preserve">o: </w:t>
+      </w:r>
+      <w:bookmarkStart w:id="2" w:name="turno"/>
+      <w:r>
+        <w:rPr>
+          <w:rFonts w:ascii="Arial" w:hAnsi="Arial" w:cs="Arial"/>
+          <w:color w:val="000000" w:themeColor="text1"/>
+          <w:sz w:val="28"/>
+          <w:szCs w:val="28"/>
+        </w:rPr>
+        <w:t>Turno</w:t>
+      </w:r>
+      <w:bookmarkEnd w:id="2"/>
+    </w:p>
+    <w:p>
+      <w:pPr>
+        <w:spacing w:line="360" w:lineRule="auto"/>
+        <w:rPr>
+          <w:rFonts w:ascii="Arial" w:hAnsi="Arial" w:cs="Arial"/>
+          <w:color w:val="000000" w:themeColor="text1"/>
+          <w:sz w:val="28"/>
+          <w:szCs w:val="28"/>
+        </w:rPr>
+      </w:pPr>
+      <w:r>
+        <w:rPr>
+          <w:rFonts w:ascii="Arial" w:hAnsi="Arial" w:cs="Arial"/>
+          <w:color w:val="000000" w:themeColor="text1"/>
+          <w:sz w:val="28"/>
+          <w:szCs w:val="28"/>
+        </w:rPr>
+        <w:t xml:space="preserve">Especialidad: </w:t>
+      </w:r>
+      <w:bookmarkStart w:id="3" w:name="especialidad"/>
+      <w:r>
+        <w:rPr>
+          <w:rFonts w:ascii="Arial" w:hAnsi="Arial" w:cs="Arial"/>
+          <w:color w:val="000000" w:themeColor="text1"/>
+          <w:sz w:val="28"/>
+          <w:szCs w:val="28"/>
+        </w:rPr>
+        <w:t>Especialidad</w:t>
+      </w:r>
+      <w:bookmarkEnd w:id="3"/>
+    </w:p>
+    <w:p>
+      <w:pPr>
+        <w:spacing w:line="360" w:lineRule="auto"/>
+        <w:rPr>
+          <w:rFonts w:ascii="Arial" w:hAnsi="Arial" w:cs="Arial"/>
+          <w:color w:val="000000" w:themeColor="text1"/>
+          <w:sz w:val="28"/>
+          <w:szCs w:val="28"/>
+        </w:rPr>
+      </w:pPr>
+      <w:r>
+        <w:rPr>
+          <w:rFonts w:ascii="Arial" w:hAnsi="Arial" w:cs="Arial"/>
+          <w:color w:val="000000" w:themeColor="text1"/>
+          <w:sz w:val="28"/>
+          <w:szCs w:val="28"/>
+        </w:rPr>
+        <w:t xml:space="preserve">Empresa: </w:t>
+      </w:r>
+      <w:bookmarkStart w:id="4" w:name="empresa"/>
+      <w:r>
+        <w:rPr>
+          <w:rFonts w:ascii="Arial" w:hAnsi="Arial" w:cs="Arial"/>
+          <w:color w:val="000000" w:themeColor="text1"/>
+          <w:sz w:val="28"/>
+          <w:szCs w:val="28"/>
+        </w:rPr>
+        <w:t>Empresa</w:t>
+      </w:r>
+      <w:bookmarkEnd w:id="4"/>
+    </w:p>
+    <w:p>
+      <w:pPr>
+        <w:spacing w:line="360" w:lineRule="auto"/>
+        <w:rPr>
+          <w:rFonts w:ascii="Arial" w:hAnsi="Arial" w:cs="Arial"/>
+          <w:color w:val="000000" w:themeColor="text1"/>
+          <w:sz w:val="28"/>
+          <w:szCs w:val="28"/>
+        </w:rPr>
+      </w:pPr>
+      <w:r>
+        <w:rPr>
+          <w:rFonts w:ascii="Arial" w:hAnsi="Arial" w:cs="Arial"/>
+          <w:color w:val="000000" w:themeColor="text1"/>
+          <w:sz w:val="28"/>
+          <w:szCs w:val="28"/>
+        </w:rPr>
+        <w:t>Coordinador de pasantía: Ing. Luis Codas</w:t>
+      </w:r>
+    </w:p>
+    <w:p>
+      <w:pPr>
+        <w:spacing w:line="360" w:lineRule="auto"/>
+        <w:rPr>
+          <w:rFonts w:ascii="Arial" w:hAnsi="Arial" w:cs="Arial"/>
+          <w:color w:val="000000" w:themeColor="text1"/>
+          <w:sz w:val="28"/>
+          <w:szCs w:val="28"/>
+        </w:rPr>
+      </w:pPr>
+      <w:r>
+        <w:rPr>
+          <w:rFonts w:ascii="Arial" w:hAnsi="Arial" w:cs="Arial"/>
+          <w:color w:val="000000" w:themeColor="text1"/>
+          <w:sz w:val="28"/>
+          <w:szCs w:val="28"/>
+        </w:rPr>
+        <w:t xml:space="preserve">Docente/Tutor: </w:t>
+      </w:r>
+      <w:bookmarkStart w:id="5" w:name="docente"/>
+      <w:r>
+        <w:rPr>
+          <w:rFonts w:ascii="Arial" w:hAnsi="Arial" w:cs="Arial"/>
+          <w:color w:val="000000" w:themeColor="text1"/>
+          <w:sz w:val="28"/>
+          <w:szCs w:val="28"/>
+        </w:rPr>
+        <w:t>Docente/Tutor</w:t>
+      </w:r>
+      <w:bookmarkEnd w:id="5"/>
+    </w:p>
+    <w:p>
+      <w:pPr>
+        <w:spacing w:line="360" w:lineRule="auto"/>
+        <w:rPr>
+          <w:rFonts w:ascii="Arial" w:hAnsi="Arial" w:cs="Arial"/>
+          <w:color w:val="000000" w:themeColor="text1"/>
+          <w:sz w:val="28"/>
+          <w:szCs w:val="28"/>
+          <w:lang w:val="es-ES"/>
+        </w:rPr>
+      </w:pPr>
+      <w:r>
+        <w:rPr>
+          <w:rFonts w:ascii="Arial" w:hAnsi="Arial" w:cs="Arial"/>
+          <w:color w:val="000000" w:themeColor="text1"/>
+          <w:sz w:val="28"/>
+          <w:szCs w:val="28"/>
+        </w:rPr>
+        <w:t xml:space="preserve">Tutor de pasantía: </w:t>
+      </w:r>
+      <w:bookmarkStart w:id="6" w:name="tutor_pasantia"/>
+      <w:r>
+        <w:rPr>
+          <w:rFonts w:ascii="Arial" w:hAnsi="Arial" w:cs="Arial"/>
+          <w:color w:val="000000" w:themeColor="text1"/>
+          <w:sz w:val="28"/>
+          <w:szCs w:val="28"/>
+        </w:rPr>
+        <w:t>Tutor de pasantía</w:t>
+      </w:r>
+      <w:bookmarkEnd w:id="6"/>
     </w:p>
     <w:p>
       <w:pPr>

</xml_diff>

<commit_message>
Ajustes en Informe de Pasantia
</commit_message>
<xml_diff>
--- a/src/main/resources/plantillas/Informe_Pasantia_Plantilla.docx
+++ b/src/main/resources/plantillas/Informe_Pasantia_Plantilla.docx
@@ -477,6 +477,20 @@
     </w:p>
     <w:p>
       <w:pPr>
+        <w:rPr>
+          <w:lang w:val="es-ES"/>
+        </w:rPr>
+      </w:pPr>
+    </w:p>
+    <w:p>
+      <w:pPr>
+        <w:rPr>
+          <w:lang w:val="es-ES"/>
+        </w:rPr>
+      </w:pPr>
+    </w:p>
+    <w:p>
+      <w:pPr>
         <w:spacing w:line="360" w:lineRule="auto"/>
         <w:rPr>
           <w:rFonts w:ascii="Arial" w:hAnsi="Arial" w:cs="Arial"/>
@@ -994,23 +1008,6 @@
         <w:tabs>
           <w:tab w:val="left" w:pos="1452"/>
         </w:tabs>
-        <w:rPr>
-          <w:lang w:val="es-ES"/>
-        </w:rPr>
-      </w:pPr>
-    </w:p>
-    <w:p>
-      <w:pPr>
-        <w:rPr>
-          <w:lang w:val="es-ES"/>
-        </w:rPr>
-      </w:pPr>
-    </w:p>
-    <w:p>
-      <w:pPr>
-        <w:tabs>
-          <w:tab w:val="left" w:pos="1452"/>
-        </w:tabs>
         <w:spacing w:line="360" w:lineRule="auto"/>
         <w:rPr>
           <w:rFonts w:ascii="Arial" w:hAnsi="Arial" w:cs="Arial"/>
@@ -1044,7 +1041,13 @@
           <w:lang w:val="es-ES"/>
         </w:rPr>
       </w:pPr>
-      <w:r>
+    </w:p>
+    <w:p>
+      <w:pPr>
+        <w:tabs>
+          <w:tab w:val="left" w:pos="1452"/>
+        </w:tabs>
+        <w:spacing w:line="360" w:lineRule="auto"/>
         <w:rPr>
           <w:rFonts w:ascii="Arial" w:hAnsi="Arial" w:cs="Arial"/>
           <w:b/>
@@ -1053,6 +1056,16 @@
           <w:szCs w:val="24"/>
           <w:lang w:val="es-ES"/>
         </w:rPr>
+      </w:pPr>
+      <w:r>
+        <w:rPr>
+          <w:rFonts w:ascii="Arial" w:hAnsi="Arial" w:cs="Arial"/>
+          <w:b/>
+          <w:bCs/>
+          <w:sz w:val="24"/>
+          <w:szCs w:val="24"/>
+          <w:lang w:val="es-ES"/>
+        </w:rPr>
         <w:lastRenderedPageBreak/>
         <w:t>INFORME DE PASANTÍA EDUCATIVA</w:t>
       </w:r>
@@ -1069,7 +1082,7 @@
           <w:bCs/>
         </w:rPr>
       </w:pPr>
-      <w:bookmarkStart w:id="14" w:name="pasantia_empresa"/>
+      <w:bookmarkStart w:id="7" w:name="pasantia_empresa"/>
       <w:r>
         <w:rPr>
           <w:rFonts w:ascii="Arial" w:hAnsi="Arial" w:cs="Arial"/>
@@ -1078,7 +1091,7 @@
         </w:rPr>
         <w:t>Departamento - Empresa</w:t>
       </w:r>
-      <w:bookmarkEnd w:id="14"/>
+      <w:bookmarkEnd w:id="7"/>
       <w:r>
         <w:rPr>
           <w:rFonts w:ascii="Arial" w:hAnsi="Arial" w:cs="Arial"/>
@@ -1108,7 +1121,7 @@
         </w:rPr>
         <w:t xml:space="preserve">Período: </w:t>
       </w:r>
-      <w:bookmarkStart w:id="15" w:name="pasantia_periodo"/>
+      <w:bookmarkStart w:id="8" w:name="pasantia_periodo"/>
       <w:r>
         <w:rPr>
           <w:rFonts w:ascii="Arial" w:hAnsi="Arial" w:cs="Arial"/>
@@ -1117,7 +1130,7 @@
         </w:rPr>
         <w:t>Periodo</w:t>
       </w:r>
-      <w:bookmarkEnd w:id="15"/>
+      <w:bookmarkEnd w:id="8"/>
     </w:p>
     <w:p>
       <w:pPr>
@@ -1350,7 +1363,7 @@
         </w:rPr>
         <w:t xml:space="preserve">SEMANA 1 </w:t>
       </w:r>
-      <w:bookmarkStart w:id="16" w:name="primera_semana_fecha"/>
+      <w:bookmarkStart w:id="9" w:name="primera_semana_fecha"/>
       <w:r>
         <w:rPr>
           <w:rFonts w:ascii="Arial" w:hAnsi="Arial" w:cs="Arial"/>
@@ -1360,313 +1373,313 @@
         </w:rPr>
         <w:t>(13 AL 17 DE OCTUBRE DE 2025)</w:t>
       </w:r>
+      <w:bookmarkEnd w:id="9"/>
+      <w:r>
+        <w:rPr>
+          <w:rFonts w:ascii="Arial" w:hAnsi="Arial" w:cs="Arial"/>
+          <w:b/>
+          <w:bCs/>
+          <w:color w:val="000000" w:themeColor="text1"/>
+        </w:rPr>
+        <w:t xml:space="preserve"> </w:t>
+      </w:r>
+    </w:p>
+    <w:p>
+      <w:pPr>
+        <w:tabs>
+          <w:tab w:val="left" w:pos="1452"/>
+        </w:tabs>
+        <w:spacing w:line="360" w:lineRule="auto"/>
+        <w:rPr>
+          <w:rFonts w:ascii="Arial" w:hAnsi="Arial" w:cs="Arial"/>
+          <w:b/>
+          <w:bCs/>
+          <w:color w:val="000000" w:themeColor="text1"/>
+        </w:rPr>
+      </w:pPr>
+      <w:bookmarkStart w:id="10" w:name="primer_lunes"/>
+      <w:r>
+        <w:rPr>
+          <w:rFonts w:ascii="Arial" w:hAnsi="Arial" w:cs="Arial"/>
+          <w:b/>
+          <w:bCs/>
+          <w:color w:val="000000" w:themeColor="text1"/>
+        </w:rPr>
+        <w:t xml:space="preserve">Lunes 13/10: </w:t>
+      </w:r>
+      <w:r>
+        <w:rPr>
+          <w:rFonts w:ascii="Arial" w:hAnsi="Arial" w:cs="Arial"/>
+          <w:b/>
+          <w:bCs/>
+          <w:color w:val="000000" w:themeColor="text1"/>
+        </w:rPr>
+        <w:t>Resumen</w:t>
+      </w:r>
+      <w:bookmarkEnd w:id="10"/>
+    </w:p>
+    <w:p>
+      <w:pPr>
+        <w:tabs>
+          <w:tab w:val="left" w:pos="1452"/>
+        </w:tabs>
+        <w:spacing w:line="360" w:lineRule="auto"/>
+        <w:rPr>
+          <w:rFonts w:ascii="Arial" w:hAnsi="Arial" w:cs="Arial"/>
+          <w:b/>
+          <w:bCs/>
+          <w:color w:val="000000" w:themeColor="text1"/>
+        </w:rPr>
+      </w:pPr>
+      <w:bookmarkStart w:id="11" w:name="primer_martes"/>
+      <w:r>
+        <w:rPr>
+          <w:rFonts w:ascii="Arial" w:hAnsi="Arial" w:cs="Arial"/>
+          <w:b/>
+          <w:bCs/>
+        </w:rPr>
+        <w:t xml:space="preserve">Martes 14/10: </w:t>
+      </w:r>
+      <w:r>
+        <w:rPr>
+          <w:rFonts w:ascii="Arial" w:hAnsi="Arial" w:cs="Arial"/>
+          <w:b/>
+          <w:bCs/>
+          <w:color w:val="000000" w:themeColor="text1"/>
+        </w:rPr>
+        <w:t>Resumen</w:t>
+      </w:r>
+      <w:bookmarkEnd w:id="11"/>
+    </w:p>
+    <w:p>
+      <w:pPr>
+        <w:tabs>
+          <w:tab w:val="left" w:pos="1452"/>
+        </w:tabs>
+        <w:spacing w:line="360" w:lineRule="auto"/>
+        <w:rPr>
+          <w:rFonts w:ascii="Arial" w:hAnsi="Arial" w:cs="Arial"/>
+          <w:b/>
+          <w:bCs/>
+          <w:color w:val="000000" w:themeColor="text1"/>
+        </w:rPr>
+      </w:pPr>
+      <w:bookmarkStart w:id="12" w:name="primer_miercoles"/>
+      <w:r>
+        <w:rPr>
+          <w:rFonts w:ascii="Arial" w:hAnsi="Arial" w:cs="Arial"/>
+          <w:b/>
+          <w:bCs/>
+        </w:rPr>
+        <w:t xml:space="preserve">Miércoles 15/10: </w:t>
+      </w:r>
+      <w:r>
+        <w:rPr>
+          <w:rFonts w:ascii="Arial" w:hAnsi="Arial" w:cs="Arial"/>
+          <w:b/>
+          <w:bCs/>
+          <w:color w:val="000000" w:themeColor="text1"/>
+        </w:rPr>
+        <w:t>Resumen</w:t>
+      </w:r>
+      <w:bookmarkEnd w:id="12"/>
+    </w:p>
+    <w:p>
+      <w:pPr>
+        <w:tabs>
+          <w:tab w:val="left" w:pos="1452"/>
+        </w:tabs>
+        <w:spacing w:line="360" w:lineRule="auto"/>
+        <w:rPr>
+          <w:rFonts w:ascii="Arial" w:hAnsi="Arial" w:cs="Arial"/>
+          <w:b/>
+          <w:bCs/>
+          <w:color w:val="000000" w:themeColor="text1"/>
+        </w:rPr>
+      </w:pPr>
+      <w:bookmarkStart w:id="13" w:name="primer_jueves"/>
+      <w:r>
+        <w:rPr>
+          <w:rFonts w:ascii="Arial" w:hAnsi="Arial" w:cs="Arial"/>
+          <w:b/>
+          <w:bCs/>
+        </w:rPr>
+        <w:t>Jueves 16</w:t>
+      </w:r>
+      <w:r>
+        <w:rPr>
+          <w:rFonts w:ascii="Arial" w:hAnsi="Arial" w:cs="Arial"/>
+          <w:b/>
+          <w:bCs/>
+          <w:lang w:val="es-ES"/>
+        </w:rPr>
+        <w:t>/</w:t>
+      </w:r>
+      <w:r>
+        <w:rPr>
+          <w:rFonts w:ascii="Arial" w:hAnsi="Arial" w:cs="Arial"/>
+          <w:b/>
+          <w:bCs/>
+        </w:rPr>
+        <w:t xml:space="preserve">10: </w:t>
+      </w:r>
+      <w:r>
+        <w:rPr>
+          <w:rFonts w:ascii="Arial" w:hAnsi="Arial" w:cs="Arial"/>
+          <w:b/>
+          <w:bCs/>
+          <w:color w:val="000000" w:themeColor="text1"/>
+        </w:rPr>
+        <w:t>Resumen</w:t>
+      </w:r>
+      <w:bookmarkEnd w:id="13"/>
+    </w:p>
+    <w:p>
+      <w:pPr>
+        <w:tabs>
+          <w:tab w:val="left" w:pos="1452"/>
+        </w:tabs>
+        <w:spacing w:line="360" w:lineRule="auto"/>
+        <w:rPr>
+          <w:rFonts w:ascii="Arial" w:hAnsi="Arial" w:cs="Arial"/>
+          <w:b/>
+          <w:bCs/>
+        </w:rPr>
+      </w:pPr>
+      <w:bookmarkStart w:id="14" w:name="primer_viernes"/>
+      <w:r>
+        <w:rPr>
+          <w:rFonts w:ascii="Arial" w:hAnsi="Arial" w:cs="Arial"/>
+          <w:b/>
+          <w:bCs/>
+        </w:rPr>
+        <w:t xml:space="preserve">Viernes 17/10: </w:t>
+      </w:r>
+      <w:r>
+        <w:rPr>
+          <w:rFonts w:ascii="Arial" w:hAnsi="Arial" w:cs="Arial"/>
+          <w:b/>
+          <w:bCs/>
+          <w:color w:val="000000" w:themeColor="text1"/>
+        </w:rPr>
+        <w:t>Resumen</w:t>
+      </w:r>
+      <w:bookmarkEnd w:id="14"/>
+    </w:p>
+    <w:p>
+      <w:pPr>
+        <w:tabs>
+          <w:tab w:val="left" w:pos="1452"/>
+        </w:tabs>
+        <w:spacing w:line="360" w:lineRule="auto"/>
+        <w:rPr>
+          <w:rFonts w:ascii="Arial" w:hAnsi="Arial" w:cs="Arial"/>
+          <w:b/>
+          <w:bCs/>
+          <w:color w:val="000000" w:themeColor="text1"/>
+        </w:rPr>
+      </w:pPr>
+      <w:bookmarkStart w:id="15" w:name="primer_sabado"/>
+      <w:r>
+        <w:rPr>
+          <w:rFonts w:ascii="Arial" w:hAnsi="Arial" w:cs="Arial"/>
+          <w:b/>
+          <w:bCs/>
+        </w:rPr>
+        <w:t>Sabado</w:t>
+      </w:r>
+      <w:r>
+        <w:rPr>
+          <w:rFonts w:ascii="Arial" w:hAnsi="Arial" w:cs="Arial"/>
+          <w:b/>
+          <w:bCs/>
+        </w:rPr>
+        <w:t xml:space="preserve"> 1</w:t>
+      </w:r>
+      <w:r>
+        <w:rPr>
+          <w:rFonts w:ascii="Arial" w:hAnsi="Arial" w:cs="Arial"/>
+          <w:b/>
+          <w:bCs/>
+        </w:rPr>
+        <w:t>8</w:t>
+      </w:r>
+      <w:r>
+        <w:rPr>
+          <w:rFonts w:ascii="Arial" w:hAnsi="Arial" w:cs="Arial"/>
+          <w:b/>
+          <w:bCs/>
+        </w:rPr>
+        <w:t xml:space="preserve">/10: </w:t>
+      </w:r>
+      <w:r>
+        <w:rPr>
+          <w:rFonts w:ascii="Arial" w:hAnsi="Arial" w:cs="Arial"/>
+          <w:b/>
+          <w:bCs/>
+          <w:color w:val="000000" w:themeColor="text1"/>
+        </w:rPr>
+        <w:t>Resumen</w:t>
+      </w:r>
+      <w:bookmarkEnd w:id="15"/>
+    </w:p>
+    <w:p>
+      <w:pPr>
+        <w:tabs>
+          <w:tab w:val="left" w:pos="1452"/>
+        </w:tabs>
+        <w:spacing w:line="360" w:lineRule="auto"/>
+        <w:rPr>
+          <w:rFonts w:ascii="Arial" w:hAnsi="Arial" w:cs="Arial"/>
+          <w:b/>
+          <w:bCs/>
+        </w:rPr>
+      </w:pPr>
+    </w:p>
+    <w:p>
+      <w:pPr>
+        <w:tabs>
+          <w:tab w:val="left" w:pos="1452"/>
+        </w:tabs>
+        <w:spacing w:line="360" w:lineRule="auto"/>
+        <w:rPr>
+          <w:rFonts w:ascii="Arial" w:hAnsi="Arial" w:cs="Arial"/>
+          <w:b/>
+          <w:bCs/>
+        </w:rPr>
+      </w:pPr>
+      <w:r>
+        <w:rPr>
+          <w:rFonts w:ascii="Arial" w:hAnsi="Arial" w:cs="Arial"/>
+          <w:b/>
+          <w:bCs/>
+        </w:rPr>
+        <w:t xml:space="preserve">SEMANA 2 </w:t>
+      </w:r>
+      <w:bookmarkStart w:id="16" w:name="segunda_semana_fecha"/>
+      <w:r>
+        <w:rPr>
+          <w:rFonts w:ascii="Arial" w:hAnsi="Arial" w:cs="Arial"/>
+          <w:b/>
+          <w:bCs/>
+        </w:rPr>
+        <w:t xml:space="preserve">(21 AL 25 DE OCTUBRE DE 2025) </w:t>
+      </w:r>
       <w:bookmarkEnd w:id="16"/>
-      <w:r>
-        <w:rPr>
-          <w:rFonts w:ascii="Arial" w:hAnsi="Arial" w:cs="Arial"/>
-          <w:b/>
-          <w:bCs/>
-          <w:color w:val="000000" w:themeColor="text1"/>
-        </w:rPr>
-        <w:t xml:space="preserve"> </w:t>
-      </w:r>
-    </w:p>
-    <w:p>
-      <w:pPr>
-        <w:tabs>
-          <w:tab w:val="left" w:pos="1452"/>
-        </w:tabs>
-        <w:spacing w:line="360" w:lineRule="auto"/>
-        <w:rPr>
-          <w:rFonts w:ascii="Arial" w:hAnsi="Arial" w:cs="Arial"/>
-          <w:b/>
-          <w:bCs/>
-          <w:color w:val="000000" w:themeColor="text1"/>
-        </w:rPr>
-      </w:pPr>
-      <w:bookmarkStart w:id="17" w:name="primer_lunes"/>
-      <w:r>
-        <w:rPr>
-          <w:rFonts w:ascii="Arial" w:hAnsi="Arial" w:cs="Arial"/>
-          <w:b/>
-          <w:bCs/>
-          <w:color w:val="000000" w:themeColor="text1"/>
-        </w:rPr>
-        <w:t xml:space="preserve">Lunes 13/10: </w:t>
-      </w:r>
-      <w:r>
-        <w:rPr>
-          <w:rFonts w:ascii="Arial" w:hAnsi="Arial" w:cs="Arial"/>
-          <w:b/>
-          <w:bCs/>
-          <w:color w:val="000000" w:themeColor="text1"/>
-        </w:rPr>
-        <w:t>Resumen</w:t>
-      </w:r>
-      <w:bookmarkEnd w:id="17"/>
-    </w:p>
-    <w:p>
-      <w:pPr>
-        <w:tabs>
-          <w:tab w:val="left" w:pos="1452"/>
-        </w:tabs>
-        <w:spacing w:line="360" w:lineRule="auto"/>
-        <w:rPr>
-          <w:rFonts w:ascii="Arial" w:hAnsi="Arial" w:cs="Arial"/>
-          <w:b/>
-          <w:bCs/>
-          <w:color w:val="000000" w:themeColor="text1"/>
-        </w:rPr>
-      </w:pPr>
-      <w:bookmarkStart w:id="18" w:name="primer_martes"/>
-      <w:r>
-        <w:rPr>
-          <w:rFonts w:ascii="Arial" w:hAnsi="Arial" w:cs="Arial"/>
-          <w:b/>
-          <w:bCs/>
-        </w:rPr>
-        <w:t xml:space="preserve">Martes 14/10: </w:t>
-      </w:r>
-      <w:r>
-        <w:rPr>
-          <w:rFonts w:ascii="Arial" w:hAnsi="Arial" w:cs="Arial"/>
-          <w:b/>
-          <w:bCs/>
-          <w:color w:val="000000" w:themeColor="text1"/>
-        </w:rPr>
-        <w:t>Resumen</w:t>
-      </w:r>
-      <w:bookmarkEnd w:id="18"/>
-    </w:p>
-    <w:p>
-      <w:pPr>
-        <w:tabs>
-          <w:tab w:val="left" w:pos="1452"/>
-        </w:tabs>
-        <w:spacing w:line="360" w:lineRule="auto"/>
-        <w:rPr>
-          <w:rFonts w:ascii="Arial" w:hAnsi="Arial" w:cs="Arial"/>
-          <w:b/>
-          <w:bCs/>
-          <w:color w:val="000000" w:themeColor="text1"/>
-        </w:rPr>
-      </w:pPr>
-      <w:bookmarkStart w:id="19" w:name="primer_miercoles"/>
-      <w:r>
-        <w:rPr>
-          <w:rFonts w:ascii="Arial" w:hAnsi="Arial" w:cs="Arial"/>
-          <w:b/>
-          <w:bCs/>
-        </w:rPr>
-        <w:t xml:space="preserve">Miércoles 15/10: </w:t>
-      </w:r>
-      <w:r>
-        <w:rPr>
-          <w:rFonts w:ascii="Arial" w:hAnsi="Arial" w:cs="Arial"/>
-          <w:b/>
-          <w:bCs/>
-          <w:color w:val="000000" w:themeColor="text1"/>
-        </w:rPr>
-        <w:t>Resumen</w:t>
-      </w:r>
-      <w:bookmarkEnd w:id="19"/>
-    </w:p>
-    <w:p>
-      <w:pPr>
-        <w:tabs>
-          <w:tab w:val="left" w:pos="1452"/>
-        </w:tabs>
-        <w:spacing w:line="360" w:lineRule="auto"/>
-        <w:rPr>
-          <w:rFonts w:ascii="Arial" w:hAnsi="Arial" w:cs="Arial"/>
-          <w:b/>
-          <w:bCs/>
-          <w:color w:val="000000" w:themeColor="text1"/>
-        </w:rPr>
-      </w:pPr>
-      <w:bookmarkStart w:id="20" w:name="primer_jueves"/>
-      <w:r>
-        <w:rPr>
-          <w:rFonts w:ascii="Arial" w:hAnsi="Arial" w:cs="Arial"/>
-          <w:b/>
-          <w:bCs/>
-        </w:rPr>
-        <w:t>Jueves 16</w:t>
-      </w:r>
-      <w:r>
-        <w:rPr>
-          <w:rFonts w:ascii="Arial" w:hAnsi="Arial" w:cs="Arial"/>
-          <w:b/>
-          <w:bCs/>
-          <w:lang w:val="es-ES"/>
-        </w:rPr>
-        <w:t>/</w:t>
-      </w:r>
-      <w:r>
-        <w:rPr>
-          <w:rFonts w:ascii="Arial" w:hAnsi="Arial" w:cs="Arial"/>
-          <w:b/>
-          <w:bCs/>
-        </w:rPr>
-        <w:t xml:space="preserve">10: </w:t>
-      </w:r>
-      <w:r>
-        <w:rPr>
-          <w:rFonts w:ascii="Arial" w:hAnsi="Arial" w:cs="Arial"/>
-          <w:b/>
-          <w:bCs/>
-          <w:color w:val="000000" w:themeColor="text1"/>
-        </w:rPr>
-        <w:t>Resumen</w:t>
-      </w:r>
-      <w:bookmarkEnd w:id="20"/>
-    </w:p>
-    <w:p>
-      <w:pPr>
-        <w:tabs>
-          <w:tab w:val="left" w:pos="1452"/>
-        </w:tabs>
-        <w:spacing w:line="360" w:lineRule="auto"/>
-        <w:rPr>
-          <w:rFonts w:ascii="Arial" w:hAnsi="Arial" w:cs="Arial"/>
-          <w:b/>
-          <w:bCs/>
-        </w:rPr>
-      </w:pPr>
-      <w:bookmarkStart w:id="21" w:name="primer_viernes"/>
-      <w:r>
-        <w:rPr>
-          <w:rFonts w:ascii="Arial" w:hAnsi="Arial" w:cs="Arial"/>
-          <w:b/>
-          <w:bCs/>
-        </w:rPr>
-        <w:t xml:space="preserve">Viernes 17/10: </w:t>
-      </w:r>
-      <w:r>
-        <w:rPr>
-          <w:rFonts w:ascii="Arial" w:hAnsi="Arial" w:cs="Arial"/>
-          <w:b/>
-          <w:bCs/>
-          <w:color w:val="000000" w:themeColor="text1"/>
-        </w:rPr>
-        <w:t>Resumen</w:t>
-      </w:r>
-      <w:bookmarkEnd w:id="21"/>
-    </w:p>
-    <w:p>
-      <w:pPr>
-        <w:tabs>
-          <w:tab w:val="left" w:pos="1452"/>
-        </w:tabs>
-        <w:spacing w:line="360" w:lineRule="auto"/>
-        <w:rPr>
-          <w:rFonts w:ascii="Arial" w:hAnsi="Arial" w:cs="Arial"/>
-          <w:b/>
-          <w:bCs/>
-          <w:color w:val="000000" w:themeColor="text1"/>
-        </w:rPr>
-      </w:pPr>
-      <w:bookmarkStart w:id="22" w:name="primer_sabado"/>
-      <w:r>
-        <w:rPr>
-          <w:rFonts w:ascii="Arial" w:hAnsi="Arial" w:cs="Arial"/>
-          <w:b/>
-          <w:bCs/>
-        </w:rPr>
-        <w:t>Sabado</w:t>
-      </w:r>
-      <w:r>
-        <w:rPr>
-          <w:rFonts w:ascii="Arial" w:hAnsi="Arial" w:cs="Arial"/>
-          <w:b/>
-          <w:bCs/>
-        </w:rPr>
-        <w:t xml:space="preserve"> 1</w:t>
-      </w:r>
-      <w:r>
-        <w:rPr>
-          <w:rFonts w:ascii="Arial" w:hAnsi="Arial" w:cs="Arial"/>
-          <w:b/>
-          <w:bCs/>
-        </w:rPr>
-        <w:t>8</w:t>
-      </w:r>
-      <w:r>
-        <w:rPr>
-          <w:rFonts w:ascii="Arial" w:hAnsi="Arial" w:cs="Arial"/>
-          <w:b/>
-          <w:bCs/>
-        </w:rPr>
-        <w:t xml:space="preserve">/10: </w:t>
-      </w:r>
-      <w:r>
-        <w:rPr>
-          <w:rFonts w:ascii="Arial" w:hAnsi="Arial" w:cs="Arial"/>
-          <w:b/>
-          <w:bCs/>
-          <w:color w:val="000000" w:themeColor="text1"/>
-        </w:rPr>
-        <w:t>Resumen</w:t>
-      </w:r>
-      <w:bookmarkEnd w:id="22"/>
-    </w:p>
-    <w:p>
-      <w:pPr>
-        <w:tabs>
-          <w:tab w:val="left" w:pos="1452"/>
-        </w:tabs>
-        <w:spacing w:line="360" w:lineRule="auto"/>
-        <w:rPr>
-          <w:rFonts w:ascii="Arial" w:hAnsi="Arial" w:cs="Arial"/>
-          <w:b/>
-          <w:bCs/>
-        </w:rPr>
-      </w:pPr>
-    </w:p>
-    <w:p>
-      <w:pPr>
-        <w:tabs>
-          <w:tab w:val="left" w:pos="1452"/>
-        </w:tabs>
-        <w:spacing w:line="360" w:lineRule="auto"/>
-        <w:rPr>
-          <w:rFonts w:ascii="Arial" w:hAnsi="Arial" w:cs="Arial"/>
-          <w:b/>
-          <w:bCs/>
-        </w:rPr>
-      </w:pPr>
-      <w:r>
-        <w:rPr>
-          <w:rFonts w:ascii="Arial" w:hAnsi="Arial" w:cs="Arial"/>
-          <w:b/>
-          <w:bCs/>
-        </w:rPr>
-        <w:t xml:space="preserve">SEMANA 2 </w:t>
-      </w:r>
-      <w:bookmarkStart w:id="23" w:name="segunda_semana_fecha"/>
-      <w:r>
-        <w:rPr>
-          <w:rFonts w:ascii="Arial" w:hAnsi="Arial" w:cs="Arial"/>
-          <w:b/>
-          <w:bCs/>
-        </w:rPr>
-        <w:t xml:space="preserve">(21 AL 25 DE OCTUBRE DE 2025) </w:t>
-      </w:r>
-      <w:bookmarkEnd w:id="23"/>
-    </w:p>
-    <w:p>
-      <w:pPr>
-        <w:tabs>
-          <w:tab w:val="left" w:pos="1452"/>
-        </w:tabs>
-        <w:spacing w:line="360" w:lineRule="auto"/>
-        <w:rPr>
-          <w:rFonts w:ascii="Arial" w:hAnsi="Arial" w:cs="Arial"/>
-          <w:b/>
-          <w:bCs/>
-        </w:rPr>
-      </w:pPr>
-      <w:bookmarkStart w:id="24" w:name="segundo_lunes"/>
+    </w:p>
+    <w:p>
+      <w:pPr>
+        <w:tabs>
+          <w:tab w:val="left" w:pos="1452"/>
+        </w:tabs>
+        <w:spacing w:line="360" w:lineRule="auto"/>
+        <w:rPr>
+          <w:rFonts w:ascii="Arial" w:hAnsi="Arial" w:cs="Arial"/>
+          <w:b/>
+          <w:bCs/>
+        </w:rPr>
+      </w:pPr>
+      <w:bookmarkStart w:id="17" w:name="segundo_lunes"/>
       <w:r>
         <w:rPr>
           <w:rFonts w:ascii="Arial" w:hAnsi="Arial" w:cs="Arial"/>
@@ -1685,6 +1698,298 @@
         </w:rPr>
         <w:t>Resumen</w:t>
       </w:r>
+      <w:bookmarkEnd w:id="17"/>
+    </w:p>
+    <w:p>
+      <w:pPr>
+        <w:tabs>
+          <w:tab w:val="left" w:pos="1452"/>
+        </w:tabs>
+        <w:spacing w:line="360" w:lineRule="auto"/>
+        <w:rPr>
+          <w:rFonts w:ascii="Arial" w:hAnsi="Arial" w:cs="Arial"/>
+        </w:rPr>
+      </w:pPr>
+      <w:bookmarkStart w:id="18" w:name="segundo_martes"/>
+      <w:r>
+        <w:rPr>
+          <w:rFonts w:ascii="Arial" w:hAnsi="Arial" w:cs="Arial"/>
+          <w:b/>
+          <w:bCs/>
+        </w:rPr>
+        <w:t xml:space="preserve">Martes 22/10: </w:t>
+      </w:r>
+      <w:r>
+        <w:rPr>
+          <w:rFonts w:ascii="Arial" w:hAnsi="Arial" w:cs="Arial"/>
+          <w:b/>
+          <w:bCs/>
+          <w:color w:val="000000" w:themeColor="text1"/>
+        </w:rPr>
+        <w:t>Resumen</w:t>
+      </w:r>
+      <w:bookmarkEnd w:id="18"/>
+    </w:p>
+    <w:p>
+      <w:pPr>
+        <w:tabs>
+          <w:tab w:val="left" w:pos="1452"/>
+        </w:tabs>
+        <w:spacing w:line="360" w:lineRule="auto"/>
+        <w:rPr>
+          <w:rFonts w:ascii="Arial" w:hAnsi="Arial" w:cs="Arial"/>
+          <w:b/>
+          <w:bCs/>
+        </w:rPr>
+      </w:pPr>
+      <w:bookmarkStart w:id="19" w:name="segundo_miercoles"/>
+      <w:r>
+        <w:rPr>
+          <w:rFonts w:ascii="Arial" w:hAnsi="Arial" w:cs="Arial"/>
+          <w:b/>
+          <w:bCs/>
+        </w:rPr>
+        <w:t xml:space="preserve">Miércoles 23/10: </w:t>
+      </w:r>
+      <w:r>
+        <w:rPr>
+          <w:rFonts w:ascii="Arial" w:hAnsi="Arial" w:cs="Arial"/>
+          <w:b/>
+          <w:bCs/>
+          <w:color w:val="000000" w:themeColor="text1"/>
+        </w:rPr>
+        <w:t>Resumen</w:t>
+      </w:r>
+      <w:bookmarkEnd w:id="19"/>
+    </w:p>
+    <w:p>
+      <w:pPr>
+        <w:tabs>
+          <w:tab w:val="left" w:pos="1452"/>
+        </w:tabs>
+        <w:spacing w:line="360" w:lineRule="auto"/>
+        <w:rPr>
+          <w:rFonts w:ascii="Arial" w:hAnsi="Arial" w:cs="Arial"/>
+          <w:b/>
+          <w:bCs/>
+        </w:rPr>
+      </w:pPr>
+      <w:bookmarkStart w:id="20" w:name="segundo_jueves"/>
+      <w:r>
+        <w:rPr>
+          <w:rFonts w:ascii="Arial" w:hAnsi="Arial" w:cs="Arial"/>
+          <w:b/>
+          <w:bCs/>
+        </w:rPr>
+        <w:t>Jueves 24</w:t>
+      </w:r>
+      <w:r>
+        <w:rPr>
+          <w:rFonts w:ascii="Arial" w:hAnsi="Arial" w:cs="Arial"/>
+          <w:b/>
+          <w:bCs/>
+        </w:rPr>
+        <w:t>/</w:t>
+      </w:r>
+      <w:r>
+        <w:rPr>
+          <w:rFonts w:ascii="Arial" w:hAnsi="Arial" w:cs="Arial"/>
+          <w:b/>
+          <w:bCs/>
+        </w:rPr>
+        <w:t xml:space="preserve">10: </w:t>
+      </w:r>
+      <w:r>
+        <w:rPr>
+          <w:rFonts w:ascii="Arial" w:hAnsi="Arial" w:cs="Arial"/>
+          <w:b/>
+          <w:bCs/>
+          <w:color w:val="000000" w:themeColor="text1"/>
+        </w:rPr>
+        <w:t>Resumen</w:t>
+      </w:r>
+      <w:bookmarkEnd w:id="20"/>
+    </w:p>
+    <w:p>
+      <w:pPr>
+        <w:tabs>
+          <w:tab w:val="left" w:pos="1452"/>
+        </w:tabs>
+        <w:spacing w:line="360" w:lineRule="auto"/>
+        <w:rPr>
+          <w:rFonts w:ascii="Arial" w:hAnsi="Arial" w:cs="Arial"/>
+          <w:b/>
+          <w:bCs/>
+          <w:color w:val="000000" w:themeColor="text1"/>
+        </w:rPr>
+      </w:pPr>
+      <w:bookmarkStart w:id="21" w:name="segundo_viernes"/>
+      <w:r>
+        <w:rPr>
+          <w:rFonts w:ascii="Arial" w:hAnsi="Arial" w:cs="Arial"/>
+          <w:b/>
+          <w:bCs/>
+        </w:rPr>
+        <w:t xml:space="preserve">Viernes 25/10: </w:t>
+      </w:r>
+      <w:r>
+        <w:rPr>
+          <w:rFonts w:ascii="Arial" w:hAnsi="Arial" w:cs="Arial"/>
+          <w:b/>
+          <w:bCs/>
+          <w:color w:val="000000" w:themeColor="text1"/>
+        </w:rPr>
+        <w:t>Resumen</w:t>
+      </w:r>
+      <w:bookmarkEnd w:id="21"/>
+    </w:p>
+    <w:p>
+      <w:pPr>
+        <w:tabs>
+          <w:tab w:val="left" w:pos="1452"/>
+        </w:tabs>
+        <w:spacing w:line="360" w:lineRule="auto"/>
+        <w:rPr>
+          <w:rFonts w:ascii="Arial" w:hAnsi="Arial" w:cs="Arial"/>
+          <w:b/>
+          <w:bCs/>
+          <w:color w:val="000000" w:themeColor="text1"/>
+        </w:rPr>
+      </w:pPr>
+      <w:bookmarkStart w:id="22" w:name="segundo_sabado"/>
+      <w:r>
+        <w:rPr>
+          <w:rFonts w:ascii="Arial" w:hAnsi="Arial" w:cs="Arial"/>
+          <w:b/>
+          <w:bCs/>
+        </w:rPr>
+        <w:t>Sabado</w:t>
+      </w:r>
+      <w:r>
+        <w:rPr>
+          <w:rFonts w:ascii="Arial" w:hAnsi="Arial" w:cs="Arial"/>
+          <w:b/>
+          <w:bCs/>
+        </w:rPr>
+        <w:t xml:space="preserve"> </w:t>
+      </w:r>
+      <w:r>
+        <w:rPr>
+          <w:rFonts w:ascii="Arial" w:hAnsi="Arial" w:cs="Arial"/>
+          <w:b/>
+          <w:bCs/>
+        </w:rPr>
+        <w:t>26</w:t>
+      </w:r>
+      <w:r>
+        <w:rPr>
+          <w:rFonts w:ascii="Arial" w:hAnsi="Arial" w:cs="Arial"/>
+          <w:b/>
+          <w:bCs/>
+        </w:rPr>
+        <w:t>/1</w:t>
+      </w:r>
+      <w:r>
+        <w:rPr>
+          <w:rFonts w:ascii="Arial" w:hAnsi="Arial" w:cs="Arial"/>
+          <w:b/>
+          <w:bCs/>
+        </w:rPr>
+        <w:t>0</w:t>
+      </w:r>
+      <w:r>
+        <w:rPr>
+          <w:rFonts w:ascii="Arial" w:hAnsi="Arial" w:cs="Arial"/>
+          <w:b/>
+          <w:bCs/>
+        </w:rPr>
+        <w:t xml:space="preserve">: </w:t>
+      </w:r>
+      <w:r>
+        <w:rPr>
+          <w:rFonts w:ascii="Arial" w:hAnsi="Arial" w:cs="Arial"/>
+          <w:b/>
+          <w:bCs/>
+          <w:color w:val="000000" w:themeColor="text1"/>
+        </w:rPr>
+        <w:t>Resumen</w:t>
+      </w:r>
+      <w:bookmarkEnd w:id="22"/>
+    </w:p>
+    <w:p>
+      <w:pPr>
+        <w:tabs>
+          <w:tab w:val="left" w:pos="1452"/>
+        </w:tabs>
+        <w:spacing w:line="360" w:lineRule="auto"/>
+        <w:rPr>
+          <w:rFonts w:ascii="Arial" w:hAnsi="Arial" w:cs="Arial"/>
+          <w:b/>
+          <w:bCs/>
+        </w:rPr>
+      </w:pPr>
+    </w:p>
+    <w:p>
+      <w:pPr>
+        <w:tabs>
+          <w:tab w:val="left" w:pos="1452"/>
+        </w:tabs>
+        <w:spacing w:line="360" w:lineRule="auto"/>
+        <w:rPr>
+          <w:rFonts w:ascii="Arial" w:hAnsi="Arial" w:cs="Arial"/>
+          <w:b/>
+          <w:bCs/>
+        </w:rPr>
+      </w:pPr>
+      <w:r>
+        <w:rPr>
+          <w:rFonts w:ascii="Arial" w:hAnsi="Arial" w:cs="Arial"/>
+          <w:b/>
+          <w:bCs/>
+        </w:rPr>
+        <w:t xml:space="preserve">SEMANA 3 </w:t>
+      </w:r>
+      <w:bookmarkStart w:id="23" w:name="tercera_semana_fecha"/>
+      <w:r>
+        <w:rPr>
+          <w:rFonts w:ascii="Arial" w:hAnsi="Arial" w:cs="Arial"/>
+          <w:b/>
+          <w:bCs/>
+        </w:rPr>
+        <w:t xml:space="preserve">(27 AL 31 DE OCTUBRE DE 2025) </w:t>
+      </w:r>
+      <w:bookmarkEnd w:id="23"/>
+    </w:p>
+    <w:p>
+      <w:pPr>
+        <w:tabs>
+          <w:tab w:val="left" w:pos="1452"/>
+        </w:tabs>
+        <w:spacing w:line="360" w:lineRule="auto"/>
+        <w:rPr>
+          <w:rFonts w:ascii="Arial" w:hAnsi="Arial" w:cs="Arial"/>
+          <w:b/>
+          <w:bCs/>
+        </w:rPr>
+      </w:pPr>
+      <w:bookmarkStart w:id="24" w:name="tercer_lunes"/>
+      <w:r>
+        <w:rPr>
+          <w:rFonts w:ascii="Arial" w:hAnsi="Arial" w:cs="Arial"/>
+          <w:b/>
+          <w:bCs/>
+        </w:rPr>
+        <w:t xml:space="preserve">Lunes 27/10: </w:t>
+      </w:r>
+      <w:r>
+        <w:rPr>
+          <w:rFonts w:ascii="Arial" w:hAnsi="Arial" w:cs="Arial"/>
+          <w:b/>
+          <w:bCs/>
+          <w:color w:val="000000" w:themeColor="text1"/>
+        </w:rPr>
+        <w:t>Resumen</w:t>
+      </w:r>
       <w:bookmarkEnd w:id="24"/>
     </w:p>
     <w:p>
@@ -1695,16 +2000,18 @@
         <w:spacing w:line="360" w:lineRule="auto"/>
         <w:rPr>
           <w:rFonts w:ascii="Arial" w:hAnsi="Arial" w:cs="Arial"/>
-        </w:rPr>
-      </w:pPr>
-      <w:bookmarkStart w:id="25" w:name="segundo_martes"/>
-      <w:r>
-        <w:rPr>
-          <w:rFonts w:ascii="Arial" w:hAnsi="Arial" w:cs="Arial"/>
-          <w:b/>
-          <w:bCs/>
-        </w:rPr>
-        <w:t xml:space="preserve">Martes 22/10: </w:t>
+          <w:b/>
+          <w:bCs/>
+        </w:rPr>
+      </w:pPr>
+      <w:bookmarkStart w:id="25" w:name="tercer_martes"/>
+      <w:r>
+        <w:rPr>
+          <w:rFonts w:ascii="Arial" w:hAnsi="Arial" w:cs="Arial"/>
+          <w:b/>
+          <w:bCs/>
+        </w:rPr>
+        <w:t xml:space="preserve">Martes 28/10: </w:t>
       </w:r>
       <w:r>
         <w:rPr>
@@ -1729,14 +2036,14 @@
           <w:bCs/>
         </w:rPr>
       </w:pPr>
-      <w:bookmarkStart w:id="26" w:name="segundo_miercoles"/>
-      <w:r>
-        <w:rPr>
-          <w:rFonts w:ascii="Arial" w:hAnsi="Arial" w:cs="Arial"/>
-          <w:b/>
-          <w:bCs/>
-        </w:rPr>
-        <w:t xml:space="preserve">Miércoles 23/10: </w:t>
+      <w:bookmarkStart w:id="26" w:name="tercer_miercoles"/>
+      <w:r>
+        <w:rPr>
+          <w:rFonts w:ascii="Arial" w:hAnsi="Arial" w:cs="Arial"/>
+          <w:b/>
+          <w:bCs/>
+        </w:rPr>
+        <w:t xml:space="preserve">Miércoles 29/10: </w:t>
       </w:r>
       <w:r>
         <w:rPr>
@@ -1761,14 +2068,188 @@
           <w:bCs/>
         </w:rPr>
       </w:pPr>
-      <w:bookmarkStart w:id="27" w:name="segundo_jueves"/>
-      <w:r>
-        <w:rPr>
-          <w:rFonts w:ascii="Arial" w:hAnsi="Arial" w:cs="Arial"/>
-          <w:b/>
-          <w:bCs/>
-        </w:rPr>
-        <w:t>Jueves 24</w:t>
+      <w:bookmarkStart w:id="27" w:name="tercer_jueves"/>
+      <w:r>
+        <w:rPr>
+          <w:rFonts w:ascii="Arial" w:hAnsi="Arial" w:cs="Arial"/>
+          <w:b/>
+          <w:bCs/>
+        </w:rPr>
+        <w:t xml:space="preserve">Jueves 30/10: </w:t>
+      </w:r>
+      <w:r>
+        <w:rPr>
+          <w:rFonts w:ascii="Arial" w:hAnsi="Arial" w:cs="Arial"/>
+          <w:b/>
+          <w:bCs/>
+          <w:color w:val="000000" w:themeColor="text1"/>
+        </w:rPr>
+        <w:t>Resumen</w:t>
+      </w:r>
+      <w:bookmarkEnd w:id="27"/>
+    </w:p>
+    <w:p>
+      <w:pPr>
+        <w:tabs>
+          <w:tab w:val="left" w:pos="1452"/>
+        </w:tabs>
+        <w:spacing w:line="360" w:lineRule="auto"/>
+        <w:rPr>
+          <w:rFonts w:ascii="Arial" w:hAnsi="Arial" w:cs="Arial"/>
+          <w:b/>
+          <w:bCs/>
+          <w:color w:val="000000" w:themeColor="text1"/>
+        </w:rPr>
+      </w:pPr>
+      <w:bookmarkStart w:id="28" w:name="tercer_viernes"/>
+      <w:r>
+        <w:rPr>
+          <w:rFonts w:ascii="Arial" w:hAnsi="Arial" w:cs="Arial"/>
+          <w:b/>
+          <w:bCs/>
+        </w:rPr>
+        <w:t xml:space="preserve">Viernes 31/10: </w:t>
+      </w:r>
+      <w:r>
+        <w:rPr>
+          <w:rFonts w:ascii="Arial" w:hAnsi="Arial" w:cs="Arial"/>
+          <w:b/>
+          <w:bCs/>
+          <w:color w:val="000000" w:themeColor="text1"/>
+        </w:rPr>
+        <w:t>Resumen</w:t>
+      </w:r>
+      <w:bookmarkEnd w:id="28"/>
+    </w:p>
+    <w:p>
+      <w:pPr>
+        <w:tabs>
+          <w:tab w:val="left" w:pos="1452"/>
+        </w:tabs>
+        <w:spacing w:line="360" w:lineRule="auto"/>
+        <w:rPr>
+          <w:rFonts w:ascii="Arial" w:hAnsi="Arial" w:cs="Arial"/>
+          <w:b/>
+          <w:bCs/>
+          <w:color w:val="000000" w:themeColor="text1"/>
+        </w:rPr>
+      </w:pPr>
+      <w:bookmarkStart w:id="29" w:name="tercer_sabado"/>
+      <w:r>
+        <w:rPr>
+          <w:rFonts w:ascii="Arial" w:hAnsi="Arial" w:cs="Arial"/>
+          <w:b/>
+          <w:bCs/>
+        </w:rPr>
+        <w:t>Sabado</w:t>
+      </w:r>
+      <w:r>
+        <w:rPr>
+          <w:rFonts w:ascii="Arial" w:hAnsi="Arial" w:cs="Arial"/>
+          <w:b/>
+          <w:bCs/>
+        </w:rPr>
+        <w:t xml:space="preserve"> </w:t>
+      </w:r>
+      <w:r>
+        <w:rPr>
+          <w:rFonts w:ascii="Arial" w:hAnsi="Arial" w:cs="Arial"/>
+          <w:b/>
+          <w:bCs/>
+        </w:rPr>
+        <w:t>01</w:t>
+      </w:r>
+      <w:r>
+        <w:rPr>
+          <w:rFonts w:ascii="Arial" w:hAnsi="Arial" w:cs="Arial"/>
+          <w:b/>
+          <w:bCs/>
+        </w:rPr>
+        <w:t xml:space="preserve">/11: </w:t>
+      </w:r>
+      <w:r>
+        <w:rPr>
+          <w:rFonts w:ascii="Arial" w:hAnsi="Arial" w:cs="Arial"/>
+          <w:b/>
+          <w:bCs/>
+          <w:color w:val="000000" w:themeColor="text1"/>
+        </w:rPr>
+        <w:t>Resumen</w:t>
+      </w:r>
+      <w:bookmarkEnd w:id="29"/>
+    </w:p>
+    <w:p>
+      <w:pPr>
+        <w:tabs>
+          <w:tab w:val="left" w:pos="1452"/>
+        </w:tabs>
+        <w:spacing w:line="360" w:lineRule="auto"/>
+        <w:rPr>
+          <w:rFonts w:ascii="Arial" w:hAnsi="Arial" w:cs="Arial"/>
+          <w:b/>
+          <w:bCs/>
+        </w:rPr>
+      </w:pPr>
+    </w:p>
+    <w:p>
+      <w:pPr>
+        <w:tabs>
+          <w:tab w:val="left" w:pos="1452"/>
+        </w:tabs>
+        <w:spacing w:line="360" w:lineRule="auto"/>
+        <w:rPr>
+          <w:rFonts w:ascii="Arial" w:hAnsi="Arial" w:cs="Arial"/>
+          <w:b/>
+          <w:bCs/>
+        </w:rPr>
+      </w:pPr>
+      <w:r>
+        <w:rPr>
+          <w:rFonts w:ascii="Arial" w:hAnsi="Arial" w:cs="Arial"/>
+          <w:b/>
+          <w:bCs/>
+        </w:rPr>
+        <w:t xml:space="preserve">SEMANA 4 </w:t>
+      </w:r>
+      <w:bookmarkStart w:id="30" w:name="cuarta_semana_fecha"/>
+      <w:r>
+        <w:rPr>
+          <w:rFonts w:ascii="Arial" w:hAnsi="Arial" w:cs="Arial"/>
+          <w:b/>
+          <w:bCs/>
+        </w:rPr>
+        <w:t>(3 AL 7 DE NOVIEMBRE DE 2025)</w:t>
+      </w:r>
+      <w:bookmarkEnd w:id="30"/>
+      <w:r>
+        <w:rPr>
+          <w:rFonts w:ascii="Arial" w:hAnsi="Arial" w:cs="Arial"/>
+          <w:b/>
+          <w:bCs/>
+        </w:rPr>
+        <w:t xml:space="preserve"> </w:t>
+      </w:r>
+    </w:p>
+    <w:p>
+      <w:pPr>
+        <w:tabs>
+          <w:tab w:val="left" w:pos="1452"/>
+        </w:tabs>
+        <w:spacing w:line="360" w:lineRule="auto"/>
+        <w:rPr>
+          <w:rFonts w:ascii="Arial" w:hAnsi="Arial" w:cs="Arial"/>
+          <w:b/>
+          <w:bCs/>
+        </w:rPr>
+      </w:pPr>
+      <w:bookmarkStart w:id="31" w:name="cuarto_lunes"/>
+      <w:r>
+        <w:rPr>
+          <w:rFonts w:ascii="Arial" w:hAnsi="Arial" w:cs="Arial"/>
+          <w:b/>
+          <w:bCs/>
+        </w:rPr>
+        <w:t>Lunes 03</w:t>
       </w:r>
       <w:r>
         <w:rPr>
@@ -1784,7 +2265,7 @@
           <w:b/>
           <w:bCs/>
         </w:rPr>
-        <w:t xml:space="preserve">10: </w:t>
+        <w:t xml:space="preserve">11 : </w:t>
       </w:r>
       <w:r>
         <w:rPr>
@@ -1795,29 +2276,44 @@
         </w:rPr>
         <w:t>Resumen</w:t>
       </w:r>
-      <w:bookmarkEnd w:id="27"/>
-    </w:p>
-    <w:p>
-      <w:pPr>
-        <w:tabs>
-          <w:tab w:val="left" w:pos="1452"/>
-        </w:tabs>
-        <w:spacing w:line="360" w:lineRule="auto"/>
-        <w:rPr>
-          <w:rFonts w:ascii="Arial" w:hAnsi="Arial" w:cs="Arial"/>
-          <w:b/>
-          <w:bCs/>
-          <w:color w:val="000000" w:themeColor="text1"/>
-        </w:rPr>
-      </w:pPr>
-      <w:bookmarkStart w:id="28" w:name="segundo_viernes"/>
-      <w:r>
-        <w:rPr>
-          <w:rFonts w:ascii="Arial" w:hAnsi="Arial" w:cs="Arial"/>
-          <w:b/>
-          <w:bCs/>
-        </w:rPr>
-        <w:t xml:space="preserve">Viernes 25/10: </w:t>
+      <w:bookmarkEnd w:id="31"/>
+    </w:p>
+    <w:p>
+      <w:pPr>
+        <w:tabs>
+          <w:tab w:val="left" w:pos="1452"/>
+        </w:tabs>
+        <w:spacing w:line="360" w:lineRule="auto"/>
+        <w:rPr>
+          <w:rFonts w:ascii="Arial" w:hAnsi="Arial" w:cs="Arial"/>
+          <w:b/>
+          <w:bCs/>
+        </w:rPr>
+      </w:pPr>
+      <w:bookmarkStart w:id="32" w:name="cuarto_martes"/>
+      <w:r>
+        <w:rPr>
+          <w:rFonts w:ascii="Arial" w:hAnsi="Arial" w:cs="Arial"/>
+          <w:b/>
+          <w:bCs/>
+        </w:rPr>
+        <w:t>Martes 04</w:t>
+      </w:r>
+      <w:r>
+        <w:rPr>
+          <w:rFonts w:ascii="Arial" w:hAnsi="Arial" w:cs="Arial"/>
+          <w:b/>
+          <w:bCs/>
+        </w:rPr>
+        <w:t>/</w:t>
+      </w:r>
+      <w:r>
+        <w:rPr>
+          <w:rFonts w:ascii="Arial" w:hAnsi="Arial" w:cs="Arial"/>
+          <w:b/>
+          <w:bCs/>
+        </w:rPr>
+        <w:t xml:space="preserve">11 : </w:t>
       </w:r>
       <w:r>
         <w:rPr>
@@ -1828,22 +2324,119 @@
         </w:rPr>
         <w:t>Resumen</w:t>
       </w:r>
-      <w:bookmarkEnd w:id="28"/>
-    </w:p>
-    <w:p>
-      <w:pPr>
-        <w:tabs>
-          <w:tab w:val="left" w:pos="1452"/>
-        </w:tabs>
-        <w:spacing w:line="360" w:lineRule="auto"/>
-        <w:rPr>
-          <w:rFonts w:ascii="Arial" w:hAnsi="Arial" w:cs="Arial"/>
-          <w:b/>
-          <w:bCs/>
-          <w:color w:val="000000" w:themeColor="text1"/>
-        </w:rPr>
-      </w:pPr>
-      <w:bookmarkStart w:id="29" w:name="segundo_sabado"/>
+      <w:bookmarkEnd w:id="32"/>
+    </w:p>
+    <w:p>
+      <w:pPr>
+        <w:tabs>
+          <w:tab w:val="left" w:pos="1452"/>
+        </w:tabs>
+        <w:spacing w:line="360" w:lineRule="auto"/>
+        <w:rPr>
+          <w:rFonts w:ascii="Arial" w:hAnsi="Arial" w:cs="Arial"/>
+          <w:b/>
+          <w:bCs/>
+        </w:rPr>
+      </w:pPr>
+      <w:bookmarkStart w:id="33" w:name="cuarto_miercoles"/>
+      <w:r>
+        <w:rPr>
+          <w:rFonts w:ascii="Arial" w:hAnsi="Arial" w:cs="Arial"/>
+          <w:b/>
+          <w:bCs/>
+        </w:rPr>
+        <w:t xml:space="preserve">Miércoles 05/11: </w:t>
+      </w:r>
+      <w:r>
+        <w:rPr>
+          <w:rFonts w:ascii="Arial" w:hAnsi="Arial" w:cs="Arial"/>
+          <w:b/>
+          <w:bCs/>
+          <w:color w:val="000000" w:themeColor="text1"/>
+        </w:rPr>
+        <w:t>Resumen</w:t>
+      </w:r>
+      <w:bookmarkEnd w:id="33"/>
+    </w:p>
+    <w:p>
+      <w:pPr>
+        <w:tabs>
+          <w:tab w:val="left" w:pos="1452"/>
+        </w:tabs>
+        <w:spacing w:line="360" w:lineRule="auto"/>
+        <w:rPr>
+          <w:rFonts w:ascii="Arial" w:hAnsi="Arial" w:cs="Arial"/>
+          <w:b/>
+          <w:bCs/>
+        </w:rPr>
+      </w:pPr>
+      <w:bookmarkStart w:id="34" w:name="cuarto_jueves"/>
+      <w:r>
+        <w:rPr>
+          <w:rFonts w:ascii="Arial" w:hAnsi="Arial" w:cs="Arial"/>
+          <w:b/>
+          <w:bCs/>
+        </w:rPr>
+        <w:t xml:space="preserve">Jueves 06/11: </w:t>
+      </w:r>
+      <w:r>
+        <w:rPr>
+          <w:rFonts w:ascii="Arial" w:hAnsi="Arial" w:cs="Arial"/>
+          <w:b/>
+          <w:bCs/>
+          <w:color w:val="000000" w:themeColor="text1"/>
+        </w:rPr>
+        <w:t>Resumen</w:t>
+      </w:r>
+      <w:bookmarkEnd w:id="34"/>
+    </w:p>
+    <w:p>
+      <w:pPr>
+        <w:tabs>
+          <w:tab w:val="left" w:pos="1452"/>
+        </w:tabs>
+        <w:spacing w:line="360" w:lineRule="auto"/>
+        <w:rPr>
+          <w:rFonts w:ascii="Arial" w:hAnsi="Arial" w:cs="Arial"/>
+          <w:b/>
+          <w:bCs/>
+          <w:color w:val="000000" w:themeColor="text1"/>
+        </w:rPr>
+      </w:pPr>
+      <w:bookmarkStart w:id="35" w:name="cuarto_viernes"/>
+      <w:r>
+        <w:rPr>
+          <w:rFonts w:ascii="Arial" w:hAnsi="Arial" w:cs="Arial"/>
+          <w:b/>
+          <w:bCs/>
+        </w:rPr>
+        <w:t xml:space="preserve">Viernes 07/11: </w:t>
+      </w:r>
+      <w:r>
+        <w:rPr>
+          <w:rFonts w:ascii="Arial" w:hAnsi="Arial" w:cs="Arial"/>
+          <w:b/>
+          <w:bCs/>
+          <w:color w:val="000000" w:themeColor="text1"/>
+        </w:rPr>
+        <w:t>Resumen</w:t>
+      </w:r>
+      <w:bookmarkEnd w:id="35"/>
+    </w:p>
+    <w:p>
+      <w:pPr>
+        <w:tabs>
+          <w:tab w:val="left" w:pos="1452"/>
+        </w:tabs>
+        <w:spacing w:line="360" w:lineRule="auto"/>
+        <w:rPr>
+          <w:rFonts w:ascii="Arial" w:hAnsi="Arial" w:cs="Arial"/>
+          <w:b/>
+          <w:bCs/>
+          <w:color w:val="000000" w:themeColor="text1"/>
+        </w:rPr>
+      </w:pPr>
+      <w:bookmarkStart w:id="36" w:name="cuarto_sabado"/>
       <w:r>
         <w:rPr>
           <w:rFonts w:ascii="Arial" w:hAnsi="Arial" w:cs="Arial"/>
@@ -1866,31 +2459,15 @@
           <w:b/>
           <w:bCs/>
         </w:rPr>
-        <w:t>26</w:t>
-      </w:r>
-      <w:r>
-        <w:rPr>
-          <w:rFonts w:ascii="Arial" w:hAnsi="Arial" w:cs="Arial"/>
-          <w:b/>
-          <w:bCs/>
-        </w:rPr>
-        <w:t>/1</w:t>
-      </w:r>
-      <w:r>
-        <w:rPr>
-          <w:rFonts w:ascii="Arial" w:hAnsi="Arial" w:cs="Arial"/>
-          <w:b/>
-          <w:bCs/>
-        </w:rPr>
-        <w:t>0</w:t>
-      </w:r>
-      <w:r>
-        <w:rPr>
-          <w:rFonts w:ascii="Arial" w:hAnsi="Arial" w:cs="Arial"/>
-          <w:b/>
-          <w:bCs/>
-        </w:rPr>
-        <w:t xml:space="preserve">: </w:t>
+        <w:t>08</w:t>
+      </w:r>
+      <w:r>
+        <w:rPr>
+          <w:rFonts w:ascii="Arial" w:hAnsi="Arial" w:cs="Arial"/>
+          <w:b/>
+          <w:bCs/>
+        </w:rPr>
+        <w:t xml:space="preserve">/11: </w:t>
       </w:r>
       <w:r>
         <w:rPr>
@@ -1901,235 +2478,51 @@
         </w:rPr>
         <w:t>Resumen</w:t>
       </w:r>
-      <w:bookmarkEnd w:id="29"/>
-    </w:p>
-    <w:p>
-      <w:pPr>
-        <w:tabs>
-          <w:tab w:val="left" w:pos="1452"/>
-        </w:tabs>
-        <w:spacing w:line="360" w:lineRule="auto"/>
-        <w:rPr>
-          <w:rFonts w:ascii="Arial" w:hAnsi="Arial" w:cs="Arial"/>
-          <w:b/>
-          <w:bCs/>
-        </w:rPr>
-      </w:pPr>
-    </w:p>
-    <w:p>
-      <w:pPr>
-        <w:tabs>
-          <w:tab w:val="left" w:pos="1452"/>
-        </w:tabs>
-        <w:spacing w:line="360" w:lineRule="auto"/>
-        <w:rPr>
-          <w:rFonts w:ascii="Arial" w:hAnsi="Arial" w:cs="Arial"/>
-          <w:b/>
-          <w:bCs/>
-        </w:rPr>
-      </w:pPr>
-      <w:r>
-        <w:rPr>
-          <w:rFonts w:ascii="Arial" w:hAnsi="Arial" w:cs="Arial"/>
-          <w:b/>
-          <w:bCs/>
-        </w:rPr>
-        <w:t xml:space="preserve">SEMANA 3 </w:t>
-      </w:r>
-      <w:bookmarkStart w:id="30" w:name="tercera_semana_fecha"/>
-      <w:r>
-        <w:rPr>
-          <w:rFonts w:ascii="Arial" w:hAnsi="Arial" w:cs="Arial"/>
-          <w:b/>
-          <w:bCs/>
-        </w:rPr>
-        <w:t xml:space="preserve">(27 AL 31 DE OCTUBRE DE 2025) </w:t>
-      </w:r>
-      <w:bookmarkEnd w:id="30"/>
-    </w:p>
-    <w:p>
-      <w:pPr>
-        <w:tabs>
-          <w:tab w:val="left" w:pos="1452"/>
-        </w:tabs>
-        <w:spacing w:line="360" w:lineRule="auto"/>
-        <w:rPr>
-          <w:rFonts w:ascii="Arial" w:hAnsi="Arial" w:cs="Arial"/>
-          <w:b/>
-          <w:bCs/>
-        </w:rPr>
-      </w:pPr>
-      <w:bookmarkStart w:id="31" w:name="tercer_lunes"/>
-      <w:r>
-        <w:rPr>
-          <w:rFonts w:ascii="Arial" w:hAnsi="Arial" w:cs="Arial"/>
-          <w:b/>
-          <w:bCs/>
-        </w:rPr>
-        <w:t xml:space="preserve">Lunes 27/10: </w:t>
-      </w:r>
-      <w:r>
-        <w:rPr>
-          <w:rFonts w:ascii="Arial" w:hAnsi="Arial" w:cs="Arial"/>
-          <w:b/>
-          <w:bCs/>
-          <w:color w:val="000000" w:themeColor="text1"/>
-        </w:rPr>
-        <w:t>Resumen</w:t>
-      </w:r>
-      <w:bookmarkEnd w:id="31"/>
-    </w:p>
-    <w:p>
-      <w:pPr>
-        <w:tabs>
-          <w:tab w:val="left" w:pos="1452"/>
-        </w:tabs>
-        <w:spacing w:line="360" w:lineRule="auto"/>
-        <w:rPr>
-          <w:rFonts w:ascii="Arial" w:hAnsi="Arial" w:cs="Arial"/>
-          <w:b/>
-          <w:bCs/>
-        </w:rPr>
-      </w:pPr>
-      <w:bookmarkStart w:id="32" w:name="tercer_martes"/>
-      <w:r>
-        <w:rPr>
-          <w:rFonts w:ascii="Arial" w:hAnsi="Arial" w:cs="Arial"/>
-          <w:b/>
-          <w:bCs/>
-        </w:rPr>
-        <w:t xml:space="preserve">Martes 28/10: </w:t>
-      </w:r>
-      <w:r>
-        <w:rPr>
-          <w:rFonts w:ascii="Arial" w:hAnsi="Arial" w:cs="Arial"/>
-          <w:b/>
-          <w:bCs/>
-          <w:color w:val="000000" w:themeColor="text1"/>
-        </w:rPr>
-        <w:t>Resumen</w:t>
-      </w:r>
-      <w:bookmarkEnd w:id="32"/>
-    </w:p>
-    <w:p>
-      <w:pPr>
-        <w:tabs>
-          <w:tab w:val="left" w:pos="1452"/>
-        </w:tabs>
-        <w:spacing w:line="360" w:lineRule="auto"/>
-        <w:rPr>
-          <w:rFonts w:ascii="Arial" w:hAnsi="Arial" w:cs="Arial"/>
-          <w:b/>
-          <w:bCs/>
-        </w:rPr>
-      </w:pPr>
-      <w:bookmarkStart w:id="33" w:name="tercer_miercoles"/>
-      <w:r>
-        <w:rPr>
-          <w:rFonts w:ascii="Arial" w:hAnsi="Arial" w:cs="Arial"/>
-          <w:b/>
-          <w:bCs/>
-        </w:rPr>
-        <w:t xml:space="preserve">Miércoles 29/10: </w:t>
-      </w:r>
-      <w:r>
-        <w:rPr>
-          <w:rFonts w:ascii="Arial" w:hAnsi="Arial" w:cs="Arial"/>
-          <w:b/>
-          <w:bCs/>
-          <w:color w:val="000000" w:themeColor="text1"/>
-        </w:rPr>
-        <w:t>Resumen</w:t>
-      </w:r>
-      <w:bookmarkEnd w:id="33"/>
-    </w:p>
-    <w:p>
-      <w:pPr>
-        <w:tabs>
-          <w:tab w:val="left" w:pos="1452"/>
-        </w:tabs>
-        <w:spacing w:line="360" w:lineRule="auto"/>
-        <w:rPr>
-          <w:rFonts w:ascii="Arial" w:hAnsi="Arial" w:cs="Arial"/>
-          <w:b/>
-          <w:bCs/>
-        </w:rPr>
-      </w:pPr>
-      <w:bookmarkStart w:id="34" w:name="tercer_jueves"/>
-      <w:r>
-        <w:rPr>
-          <w:rFonts w:ascii="Arial" w:hAnsi="Arial" w:cs="Arial"/>
-          <w:b/>
-          <w:bCs/>
-        </w:rPr>
-        <w:t xml:space="preserve">Jueves 30/10: </w:t>
-      </w:r>
-      <w:r>
-        <w:rPr>
-          <w:rFonts w:ascii="Arial" w:hAnsi="Arial" w:cs="Arial"/>
-          <w:b/>
-          <w:bCs/>
-          <w:color w:val="000000" w:themeColor="text1"/>
-        </w:rPr>
-        <w:t>Resumen</w:t>
-      </w:r>
-      <w:bookmarkEnd w:id="34"/>
-    </w:p>
-    <w:p>
-      <w:pPr>
-        <w:tabs>
-          <w:tab w:val="left" w:pos="1452"/>
-        </w:tabs>
-        <w:spacing w:line="360" w:lineRule="auto"/>
-        <w:rPr>
-          <w:rFonts w:ascii="Arial" w:hAnsi="Arial" w:cs="Arial"/>
-          <w:b/>
-          <w:bCs/>
-          <w:color w:val="000000" w:themeColor="text1"/>
-        </w:rPr>
-      </w:pPr>
-      <w:bookmarkStart w:id="35" w:name="tercer_viernes"/>
-      <w:r>
-        <w:rPr>
-          <w:rFonts w:ascii="Arial" w:hAnsi="Arial" w:cs="Arial"/>
-          <w:b/>
-          <w:bCs/>
-        </w:rPr>
-        <w:t xml:space="preserve">Viernes 31/10: </w:t>
-      </w:r>
-      <w:r>
-        <w:rPr>
-          <w:rFonts w:ascii="Arial" w:hAnsi="Arial" w:cs="Arial"/>
-          <w:b/>
-          <w:bCs/>
-          <w:color w:val="000000" w:themeColor="text1"/>
-        </w:rPr>
-        <w:t>Resumen</w:t>
-      </w:r>
-      <w:bookmarkEnd w:id="35"/>
-    </w:p>
-    <w:p>
-      <w:pPr>
-        <w:tabs>
-          <w:tab w:val="left" w:pos="1452"/>
-        </w:tabs>
-        <w:spacing w:line="360" w:lineRule="auto"/>
-        <w:rPr>
-          <w:rFonts w:ascii="Arial" w:hAnsi="Arial" w:cs="Arial"/>
-          <w:b/>
-          <w:bCs/>
-          <w:color w:val="000000" w:themeColor="text1"/>
-        </w:rPr>
-      </w:pPr>
-      <w:bookmarkStart w:id="36" w:name="tercer_sabado"/>
-      <w:r>
-        <w:rPr>
-          <w:rFonts w:ascii="Arial" w:hAnsi="Arial" w:cs="Arial"/>
-          <w:b/>
-          <w:bCs/>
-        </w:rPr>
-        <w:t>Sabado</w:t>
-      </w:r>
+      <w:bookmarkEnd w:id="36"/>
+    </w:p>
+    <w:p>
+      <w:pPr>
+        <w:tabs>
+          <w:tab w:val="left" w:pos="1452"/>
+        </w:tabs>
+        <w:spacing w:line="360" w:lineRule="auto"/>
+        <w:rPr>
+          <w:rFonts w:ascii="Arial" w:hAnsi="Arial" w:cs="Arial"/>
+          <w:b/>
+          <w:bCs/>
+        </w:rPr>
+      </w:pPr>
+    </w:p>
+    <w:p>
+      <w:pPr>
+        <w:tabs>
+          <w:tab w:val="left" w:pos="1452"/>
+        </w:tabs>
+        <w:spacing w:line="360" w:lineRule="auto"/>
+        <w:rPr>
+          <w:rFonts w:ascii="Arial" w:hAnsi="Arial" w:cs="Arial"/>
+          <w:b/>
+          <w:bCs/>
+        </w:rPr>
+      </w:pPr>
+      <w:r>
+        <w:rPr>
+          <w:rFonts w:ascii="Arial" w:hAnsi="Arial" w:cs="Arial"/>
+          <w:b/>
+          <w:bCs/>
+        </w:rPr>
+        <w:t xml:space="preserve">SEMANA 5 </w:t>
+      </w:r>
+      <w:bookmarkStart w:id="37" w:name="quinta_semana_fecha"/>
+      <w:r>
+        <w:rPr>
+          <w:rFonts w:ascii="Arial" w:hAnsi="Arial" w:cs="Arial"/>
+          <w:b/>
+          <w:bCs/>
+        </w:rPr>
+        <w:t>(10 AL 14 DE NOVEMBRE DE 2025)</w:t>
+      </w:r>
+      <w:bookmarkEnd w:id="37"/>
       <w:r>
         <w:rPr>
           <w:rFonts w:ascii="Arial" w:hAnsi="Arial" w:cs="Arial"/>
@@ -2138,400 +2531,20 @@
         </w:rPr>
         <w:t xml:space="preserve"> </w:t>
       </w:r>
-      <w:r>
-        <w:rPr>
-          <w:rFonts w:ascii="Arial" w:hAnsi="Arial" w:cs="Arial"/>
-          <w:b/>
-          <w:bCs/>
-        </w:rPr>
-        <w:t>01</w:t>
-      </w:r>
-      <w:r>
-        <w:rPr>
-          <w:rFonts w:ascii="Arial" w:hAnsi="Arial" w:cs="Arial"/>
-          <w:b/>
-          <w:bCs/>
-        </w:rPr>
-        <w:t xml:space="preserve">/11: </w:t>
-      </w:r>
-      <w:r>
-        <w:rPr>
-          <w:rFonts w:ascii="Arial" w:hAnsi="Arial" w:cs="Arial"/>
-          <w:b/>
-          <w:bCs/>
-          <w:color w:val="000000" w:themeColor="text1"/>
-        </w:rPr>
-        <w:t>Resumen</w:t>
-      </w:r>
-      <w:bookmarkEnd w:id="36"/>
-    </w:p>
-    <w:p>
-      <w:pPr>
-        <w:tabs>
-          <w:tab w:val="left" w:pos="1452"/>
-        </w:tabs>
-        <w:spacing w:line="360" w:lineRule="auto"/>
-        <w:rPr>
-          <w:rFonts w:ascii="Arial" w:hAnsi="Arial" w:cs="Arial"/>
-          <w:b/>
-          <w:bCs/>
-        </w:rPr>
-      </w:pPr>
-    </w:p>
-    <w:p>
-      <w:pPr>
-        <w:tabs>
-          <w:tab w:val="left" w:pos="1452"/>
-        </w:tabs>
-        <w:spacing w:line="360" w:lineRule="auto"/>
-        <w:rPr>
-          <w:rFonts w:ascii="Arial" w:hAnsi="Arial" w:cs="Arial"/>
-          <w:b/>
-          <w:bCs/>
-        </w:rPr>
-      </w:pPr>
-      <w:r>
-        <w:rPr>
-          <w:rFonts w:ascii="Arial" w:hAnsi="Arial" w:cs="Arial"/>
-          <w:b/>
-          <w:bCs/>
-        </w:rPr>
-        <w:t xml:space="preserve">SEMANA 4 </w:t>
-      </w:r>
-      <w:bookmarkStart w:id="37" w:name="cuarta_semana_fecha"/>
-      <w:r>
-        <w:rPr>
-          <w:rFonts w:ascii="Arial" w:hAnsi="Arial" w:cs="Arial"/>
-          <w:b/>
-          <w:bCs/>
-        </w:rPr>
-        <w:t>(3 AL 7 DE NOVIEMBRE DE 2025)</w:t>
-      </w:r>
-      <w:bookmarkEnd w:id="37"/>
-      <w:r>
-        <w:rPr>
-          <w:rFonts w:ascii="Arial" w:hAnsi="Arial" w:cs="Arial"/>
-          <w:b/>
-          <w:bCs/>
-        </w:rPr>
-        <w:t xml:space="preserve"> </w:t>
-      </w:r>
-    </w:p>
-    <w:p>
-      <w:pPr>
-        <w:tabs>
-          <w:tab w:val="left" w:pos="1452"/>
-        </w:tabs>
-        <w:spacing w:line="360" w:lineRule="auto"/>
-        <w:rPr>
-          <w:rFonts w:ascii="Arial" w:hAnsi="Arial" w:cs="Arial"/>
-          <w:b/>
-          <w:bCs/>
-        </w:rPr>
-      </w:pPr>
-      <w:bookmarkStart w:id="38" w:name="cuarto_lunes"/>
-      <w:r>
-        <w:rPr>
-          <w:rFonts w:ascii="Arial" w:hAnsi="Arial" w:cs="Arial"/>
-          <w:b/>
-          <w:bCs/>
-        </w:rPr>
-        <w:t>Lunes 03</w:t>
-      </w:r>
-      <w:r>
-        <w:rPr>
-          <w:rFonts w:ascii="Arial" w:hAnsi="Arial" w:cs="Arial"/>
-          <w:b/>
-          <w:bCs/>
-        </w:rPr>
-        <w:t>/</w:t>
-      </w:r>
-      <w:r>
-        <w:rPr>
-          <w:rFonts w:ascii="Arial" w:hAnsi="Arial" w:cs="Arial"/>
-          <w:b/>
-          <w:bCs/>
-        </w:rPr>
-        <w:t xml:space="preserve">11 : </w:t>
-      </w:r>
-      <w:r>
-        <w:rPr>
-          <w:rFonts w:ascii="Arial" w:hAnsi="Arial" w:cs="Arial"/>
-          <w:b/>
-          <w:bCs/>
-          <w:color w:val="000000" w:themeColor="text1"/>
-        </w:rPr>
-        <w:t>Resumen</w:t>
-      </w:r>
-      <w:bookmarkEnd w:id="38"/>
-    </w:p>
-    <w:p>
-      <w:pPr>
-        <w:tabs>
-          <w:tab w:val="left" w:pos="1452"/>
-        </w:tabs>
-        <w:spacing w:line="360" w:lineRule="auto"/>
-        <w:rPr>
-          <w:rFonts w:ascii="Arial" w:hAnsi="Arial" w:cs="Arial"/>
-          <w:b/>
-          <w:bCs/>
-        </w:rPr>
-      </w:pPr>
-      <w:bookmarkStart w:id="39" w:name="cuarto_martes"/>
-      <w:r>
-        <w:rPr>
-          <w:rFonts w:ascii="Arial" w:hAnsi="Arial" w:cs="Arial"/>
-          <w:b/>
-          <w:bCs/>
-        </w:rPr>
-        <w:t>Martes 04</w:t>
-      </w:r>
-      <w:r>
-        <w:rPr>
-          <w:rFonts w:ascii="Arial" w:hAnsi="Arial" w:cs="Arial"/>
-          <w:b/>
-          <w:bCs/>
-        </w:rPr>
-        <w:t>/</w:t>
-      </w:r>
-      <w:r>
-        <w:rPr>
-          <w:rFonts w:ascii="Arial" w:hAnsi="Arial" w:cs="Arial"/>
-          <w:b/>
-          <w:bCs/>
-        </w:rPr>
-        <w:t xml:space="preserve">11 : </w:t>
-      </w:r>
-      <w:r>
-        <w:rPr>
-          <w:rFonts w:ascii="Arial" w:hAnsi="Arial" w:cs="Arial"/>
-          <w:b/>
-          <w:bCs/>
-          <w:color w:val="000000" w:themeColor="text1"/>
-        </w:rPr>
-        <w:t>Resumen</w:t>
-      </w:r>
-      <w:bookmarkEnd w:id="39"/>
-    </w:p>
-    <w:p>
-      <w:pPr>
-        <w:tabs>
-          <w:tab w:val="left" w:pos="1452"/>
-        </w:tabs>
-        <w:spacing w:line="360" w:lineRule="auto"/>
-        <w:rPr>
-          <w:rFonts w:ascii="Arial" w:hAnsi="Arial" w:cs="Arial"/>
-          <w:b/>
-          <w:bCs/>
-        </w:rPr>
-      </w:pPr>
-      <w:bookmarkStart w:id="40" w:name="cuarto_miercoles"/>
-      <w:r>
-        <w:rPr>
-          <w:rFonts w:ascii="Arial" w:hAnsi="Arial" w:cs="Arial"/>
-          <w:b/>
-          <w:bCs/>
-        </w:rPr>
-        <w:t xml:space="preserve">Miércoles 05/11: </w:t>
-      </w:r>
-      <w:r>
-        <w:rPr>
-          <w:rFonts w:ascii="Arial" w:hAnsi="Arial" w:cs="Arial"/>
-          <w:b/>
-          <w:bCs/>
-          <w:color w:val="000000" w:themeColor="text1"/>
-        </w:rPr>
-        <w:t>Resumen</w:t>
-      </w:r>
-      <w:bookmarkEnd w:id="40"/>
-    </w:p>
-    <w:p>
-      <w:pPr>
-        <w:tabs>
-          <w:tab w:val="left" w:pos="1452"/>
-        </w:tabs>
-        <w:spacing w:line="360" w:lineRule="auto"/>
-        <w:rPr>
-          <w:rFonts w:ascii="Arial" w:hAnsi="Arial" w:cs="Arial"/>
-          <w:b/>
-          <w:bCs/>
-        </w:rPr>
-      </w:pPr>
-      <w:bookmarkStart w:id="41" w:name="cuarto_jueves"/>
-      <w:r>
-        <w:rPr>
-          <w:rFonts w:ascii="Arial" w:hAnsi="Arial" w:cs="Arial"/>
-          <w:b/>
-          <w:bCs/>
-        </w:rPr>
-        <w:t xml:space="preserve">Jueves 06/11: </w:t>
-      </w:r>
-      <w:r>
-        <w:rPr>
-          <w:rFonts w:ascii="Arial" w:hAnsi="Arial" w:cs="Arial"/>
-          <w:b/>
-          <w:bCs/>
-          <w:color w:val="000000" w:themeColor="text1"/>
-        </w:rPr>
-        <w:t>Resumen</w:t>
-      </w:r>
-      <w:bookmarkEnd w:id="41"/>
-    </w:p>
-    <w:p>
-      <w:pPr>
-        <w:tabs>
-          <w:tab w:val="left" w:pos="1452"/>
-        </w:tabs>
-        <w:spacing w:line="360" w:lineRule="auto"/>
-        <w:rPr>
-          <w:rFonts w:ascii="Arial" w:hAnsi="Arial" w:cs="Arial"/>
-          <w:b/>
-          <w:bCs/>
-          <w:color w:val="000000" w:themeColor="text1"/>
-        </w:rPr>
-      </w:pPr>
-      <w:bookmarkStart w:id="42" w:name="cuarto_viernes"/>
-      <w:r>
-        <w:rPr>
-          <w:rFonts w:ascii="Arial" w:hAnsi="Arial" w:cs="Arial"/>
-          <w:b/>
-          <w:bCs/>
-        </w:rPr>
-        <w:t xml:space="preserve">Viernes 07/11: </w:t>
-      </w:r>
-      <w:r>
-        <w:rPr>
-          <w:rFonts w:ascii="Arial" w:hAnsi="Arial" w:cs="Arial"/>
-          <w:b/>
-          <w:bCs/>
-          <w:color w:val="000000" w:themeColor="text1"/>
-        </w:rPr>
-        <w:t>Resumen</w:t>
-      </w:r>
-      <w:bookmarkEnd w:id="42"/>
-    </w:p>
-    <w:p>
-      <w:pPr>
-        <w:tabs>
-          <w:tab w:val="left" w:pos="1452"/>
-        </w:tabs>
-        <w:spacing w:line="360" w:lineRule="auto"/>
-        <w:rPr>
-          <w:rFonts w:ascii="Arial" w:hAnsi="Arial" w:cs="Arial"/>
-          <w:b/>
-          <w:bCs/>
-          <w:color w:val="000000" w:themeColor="text1"/>
-        </w:rPr>
-      </w:pPr>
-      <w:bookmarkStart w:id="43" w:name="cuarto_sabado"/>
-      <w:r>
-        <w:rPr>
-          <w:rFonts w:ascii="Arial" w:hAnsi="Arial" w:cs="Arial"/>
-          <w:b/>
-          <w:bCs/>
-        </w:rPr>
-        <w:t>Sabado</w:t>
-      </w:r>
-      <w:r>
-        <w:rPr>
-          <w:rFonts w:ascii="Arial" w:hAnsi="Arial" w:cs="Arial"/>
-          <w:b/>
-          <w:bCs/>
-        </w:rPr>
-        <w:t xml:space="preserve"> </w:t>
-      </w:r>
-      <w:r>
-        <w:rPr>
-          <w:rFonts w:ascii="Arial" w:hAnsi="Arial" w:cs="Arial"/>
-          <w:b/>
-          <w:bCs/>
-        </w:rPr>
-        <w:t>08</w:t>
-      </w:r>
-      <w:r>
-        <w:rPr>
-          <w:rFonts w:ascii="Arial" w:hAnsi="Arial" w:cs="Arial"/>
-          <w:b/>
-          <w:bCs/>
-        </w:rPr>
-        <w:t xml:space="preserve">/11: </w:t>
-      </w:r>
-      <w:r>
-        <w:rPr>
-          <w:rFonts w:ascii="Arial" w:hAnsi="Arial" w:cs="Arial"/>
-          <w:b/>
-          <w:bCs/>
-          <w:color w:val="000000" w:themeColor="text1"/>
-        </w:rPr>
-        <w:t>Resumen</w:t>
-      </w:r>
-      <w:bookmarkEnd w:id="43"/>
-    </w:p>
-    <w:p>
-      <w:pPr>
-        <w:tabs>
-          <w:tab w:val="left" w:pos="1452"/>
-        </w:tabs>
-        <w:spacing w:line="360" w:lineRule="auto"/>
-        <w:rPr>
-          <w:rFonts w:ascii="Arial" w:hAnsi="Arial" w:cs="Arial"/>
-          <w:b/>
-          <w:bCs/>
-        </w:rPr>
-      </w:pPr>
-    </w:p>
-    <w:p>
-      <w:pPr>
-        <w:tabs>
-          <w:tab w:val="left" w:pos="1452"/>
-        </w:tabs>
-        <w:spacing w:line="360" w:lineRule="auto"/>
-        <w:rPr>
-          <w:rFonts w:ascii="Arial" w:hAnsi="Arial" w:cs="Arial"/>
-          <w:b/>
-          <w:bCs/>
-        </w:rPr>
-      </w:pPr>
-      <w:r>
-        <w:rPr>
-          <w:rFonts w:ascii="Arial" w:hAnsi="Arial" w:cs="Arial"/>
-          <w:b/>
-          <w:bCs/>
-        </w:rPr>
-        <w:t xml:space="preserve">SEMANA 5 </w:t>
-      </w:r>
-      <w:bookmarkStart w:id="44" w:name="quinta_semana_fecha"/>
-      <w:r>
-        <w:rPr>
-          <w:rFonts w:ascii="Arial" w:hAnsi="Arial" w:cs="Arial"/>
-          <w:b/>
-          <w:bCs/>
-        </w:rPr>
-        <w:t>(10 AL 14 DE NOVEMBRE DE 2025)</w:t>
-      </w:r>
-      <w:bookmarkEnd w:id="44"/>
-      <w:r>
-        <w:rPr>
-          <w:rFonts w:ascii="Arial" w:hAnsi="Arial" w:cs="Arial"/>
-          <w:b/>
-          <w:bCs/>
-        </w:rPr>
-        <w:t xml:space="preserve"> </w:t>
-      </w:r>
-    </w:p>
-    <w:p>
-      <w:pPr>
-        <w:tabs>
-          <w:tab w:val="left" w:pos="1452"/>
-        </w:tabs>
-        <w:spacing w:line="360" w:lineRule="auto"/>
-        <w:rPr>
-          <w:rFonts w:ascii="Arial" w:hAnsi="Arial" w:cs="Arial"/>
-          <w:b/>
-          <w:bCs/>
-        </w:rPr>
-      </w:pPr>
-      <w:bookmarkStart w:id="45" w:name="quinto_lunes"/>
+    </w:p>
+    <w:p>
+      <w:pPr>
+        <w:tabs>
+          <w:tab w:val="left" w:pos="1452"/>
+        </w:tabs>
+        <w:spacing w:line="360" w:lineRule="auto"/>
+        <w:rPr>
+          <w:rFonts w:ascii="Arial" w:hAnsi="Arial" w:cs="Arial"/>
+          <w:b/>
+          <w:bCs/>
+        </w:rPr>
+      </w:pPr>
+      <w:bookmarkStart w:id="38" w:name="quinto_lunes"/>
       <w:r>
         <w:rPr>
           <w:rFonts w:ascii="Arial" w:hAnsi="Arial" w:cs="Arial"/>
@@ -2550,6 +2563,324 @@
         </w:rPr>
         <w:t>Resumen</w:t>
       </w:r>
+      <w:bookmarkEnd w:id="38"/>
+    </w:p>
+    <w:p>
+      <w:pPr>
+        <w:tabs>
+          <w:tab w:val="left" w:pos="1452"/>
+        </w:tabs>
+        <w:spacing w:line="360" w:lineRule="auto"/>
+        <w:rPr>
+          <w:rFonts w:ascii="Arial" w:hAnsi="Arial" w:cs="Arial"/>
+          <w:b/>
+          <w:bCs/>
+        </w:rPr>
+      </w:pPr>
+      <w:bookmarkStart w:id="39" w:name="quinto_martes"/>
+      <w:r>
+        <w:rPr>
+          <w:rFonts w:ascii="Arial" w:hAnsi="Arial" w:cs="Arial"/>
+          <w:b/>
+          <w:bCs/>
+        </w:rPr>
+        <w:t xml:space="preserve">Martes 11/11: </w:t>
+      </w:r>
+      <w:r>
+        <w:rPr>
+          <w:rFonts w:ascii="Arial" w:hAnsi="Arial" w:cs="Arial"/>
+          <w:b/>
+          <w:bCs/>
+          <w:color w:val="000000" w:themeColor="text1"/>
+        </w:rPr>
+        <w:t>Resumen</w:t>
+      </w:r>
+      <w:bookmarkEnd w:id="39"/>
+    </w:p>
+    <w:p>
+      <w:pPr>
+        <w:tabs>
+          <w:tab w:val="left" w:pos="1452"/>
+        </w:tabs>
+        <w:spacing w:line="360" w:lineRule="auto"/>
+        <w:rPr>
+          <w:rFonts w:ascii="Arial" w:hAnsi="Arial" w:cs="Arial"/>
+          <w:b/>
+          <w:bCs/>
+        </w:rPr>
+      </w:pPr>
+      <w:bookmarkStart w:id="40" w:name="quinto_miercoles"/>
+      <w:r>
+        <w:rPr>
+          <w:rFonts w:ascii="Arial" w:hAnsi="Arial" w:cs="Arial"/>
+          <w:b/>
+          <w:bCs/>
+        </w:rPr>
+        <w:t>Miérco</w:t>
+      </w:r>
+      <w:r>
+        <w:rPr>
+          <w:rFonts w:ascii="Arial" w:hAnsi="Arial" w:cs="Arial"/>
+          <w:b/>
+          <w:bCs/>
+        </w:rPr>
+        <w:t>les</w:t>
+      </w:r>
+      <w:r>
+        <w:rPr>
+          <w:rFonts w:ascii="Arial" w:hAnsi="Arial" w:cs="Arial"/>
+          <w:b/>
+          <w:bCs/>
+        </w:rPr>
+        <w:t xml:space="preserve"> 12/11: </w:t>
+      </w:r>
+      <w:r>
+        <w:rPr>
+          <w:rFonts w:ascii="Arial" w:hAnsi="Arial" w:cs="Arial"/>
+          <w:b/>
+          <w:bCs/>
+          <w:color w:val="000000" w:themeColor="text1"/>
+        </w:rPr>
+        <w:t>Resumen</w:t>
+      </w:r>
+      <w:bookmarkEnd w:id="40"/>
+    </w:p>
+    <w:p>
+      <w:pPr>
+        <w:tabs>
+          <w:tab w:val="left" w:pos="1452"/>
+        </w:tabs>
+        <w:spacing w:line="360" w:lineRule="auto"/>
+        <w:rPr>
+          <w:rFonts w:ascii="Arial" w:hAnsi="Arial" w:cs="Arial"/>
+          <w:b/>
+          <w:bCs/>
+        </w:rPr>
+      </w:pPr>
+      <w:bookmarkStart w:id="41" w:name="quinto_jueves"/>
+      <w:r>
+        <w:rPr>
+          <w:rFonts w:ascii="Arial" w:hAnsi="Arial" w:cs="Arial"/>
+          <w:b/>
+          <w:bCs/>
+        </w:rPr>
+        <w:t>Jueves 13</w:t>
+      </w:r>
+      <w:r>
+        <w:rPr>
+          <w:rFonts w:ascii="Arial" w:hAnsi="Arial" w:cs="Arial"/>
+          <w:b/>
+          <w:bCs/>
+        </w:rPr>
+        <w:t>/</w:t>
+      </w:r>
+      <w:r>
+        <w:rPr>
+          <w:rFonts w:ascii="Arial" w:hAnsi="Arial" w:cs="Arial"/>
+          <w:b/>
+          <w:bCs/>
+        </w:rPr>
+        <w:t xml:space="preserve">11: </w:t>
+      </w:r>
+      <w:r>
+        <w:rPr>
+          <w:rFonts w:ascii="Arial" w:hAnsi="Arial" w:cs="Arial"/>
+          <w:b/>
+          <w:bCs/>
+          <w:color w:val="000000" w:themeColor="text1"/>
+        </w:rPr>
+        <w:t>Resumen</w:t>
+      </w:r>
+      <w:bookmarkEnd w:id="41"/>
+    </w:p>
+    <w:p>
+      <w:pPr>
+        <w:tabs>
+          <w:tab w:val="left" w:pos="1452"/>
+        </w:tabs>
+        <w:spacing w:line="360" w:lineRule="auto"/>
+        <w:rPr>
+          <w:rFonts w:ascii="Arial" w:hAnsi="Arial" w:cs="Arial"/>
+          <w:b/>
+          <w:bCs/>
+          <w:color w:val="000000" w:themeColor="text1"/>
+        </w:rPr>
+      </w:pPr>
+      <w:bookmarkStart w:id="42" w:name="quinto_viernes"/>
+      <w:r>
+        <w:rPr>
+          <w:rFonts w:ascii="Arial" w:hAnsi="Arial" w:cs="Arial"/>
+          <w:b/>
+          <w:bCs/>
+        </w:rPr>
+        <w:t xml:space="preserve">Viernes 14/11: </w:t>
+      </w:r>
+      <w:r>
+        <w:rPr>
+          <w:rFonts w:ascii="Arial" w:hAnsi="Arial" w:cs="Arial"/>
+          <w:b/>
+          <w:bCs/>
+          <w:color w:val="000000" w:themeColor="text1"/>
+        </w:rPr>
+        <w:t>Resumen</w:t>
+      </w:r>
+      <w:bookmarkEnd w:id="42"/>
+    </w:p>
+    <w:p>
+      <w:pPr>
+        <w:tabs>
+          <w:tab w:val="left" w:pos="1452"/>
+        </w:tabs>
+        <w:spacing w:line="360" w:lineRule="auto"/>
+        <w:rPr>
+          <w:rFonts w:ascii="Arial" w:hAnsi="Arial" w:cs="Arial"/>
+          <w:b/>
+          <w:bCs/>
+          <w:color w:val="000000" w:themeColor="text1"/>
+        </w:rPr>
+      </w:pPr>
+      <w:bookmarkStart w:id="43" w:name="quinto_sabado"/>
+      <w:r>
+        <w:rPr>
+          <w:rFonts w:ascii="Arial" w:hAnsi="Arial" w:cs="Arial"/>
+          <w:b/>
+          <w:bCs/>
+        </w:rPr>
+        <w:t>Sabado</w:t>
+      </w:r>
+      <w:r>
+        <w:rPr>
+          <w:rFonts w:ascii="Arial" w:hAnsi="Arial" w:cs="Arial"/>
+          <w:b/>
+          <w:bCs/>
+        </w:rPr>
+        <w:t xml:space="preserve"> </w:t>
+      </w:r>
+      <w:r>
+        <w:rPr>
+          <w:rFonts w:ascii="Arial" w:hAnsi="Arial" w:cs="Arial"/>
+          <w:b/>
+          <w:bCs/>
+        </w:rPr>
+        <w:t>15</w:t>
+      </w:r>
+      <w:r>
+        <w:rPr>
+          <w:rFonts w:ascii="Arial" w:hAnsi="Arial" w:cs="Arial"/>
+          <w:b/>
+          <w:bCs/>
+        </w:rPr>
+        <w:t xml:space="preserve">/11: </w:t>
+      </w:r>
+      <w:r>
+        <w:rPr>
+          <w:rFonts w:ascii="Arial" w:hAnsi="Arial" w:cs="Arial"/>
+          <w:b/>
+          <w:bCs/>
+          <w:color w:val="000000" w:themeColor="text1"/>
+        </w:rPr>
+        <w:t>Resumen</w:t>
+      </w:r>
+      <w:bookmarkEnd w:id="43"/>
+    </w:p>
+    <w:p>
+      <w:pPr>
+        <w:tabs>
+          <w:tab w:val="left" w:pos="1452"/>
+        </w:tabs>
+        <w:spacing w:line="360" w:lineRule="auto"/>
+        <w:rPr>
+          <w:rFonts w:ascii="Arial" w:hAnsi="Arial" w:cs="Arial"/>
+          <w:b/>
+          <w:bCs/>
+        </w:rPr>
+      </w:pPr>
+    </w:p>
+    <w:p>
+      <w:pPr>
+        <w:tabs>
+          <w:tab w:val="left" w:pos="1452"/>
+        </w:tabs>
+        <w:spacing w:line="360" w:lineRule="auto"/>
+        <w:rPr>
+          <w:rFonts w:ascii="Arial" w:hAnsi="Arial" w:cs="Arial"/>
+          <w:b/>
+          <w:bCs/>
+        </w:rPr>
+      </w:pPr>
+      <w:r>
+        <w:rPr>
+          <w:rFonts w:ascii="Arial" w:hAnsi="Arial" w:cs="Arial"/>
+          <w:b/>
+          <w:bCs/>
+        </w:rPr>
+        <w:t xml:space="preserve">SEMANA 6 </w:t>
+      </w:r>
+      <w:bookmarkStart w:id="44" w:name="sexta_semana_fecha"/>
+      <w:r>
+        <w:rPr>
+          <w:rFonts w:ascii="Arial" w:hAnsi="Arial" w:cs="Arial"/>
+          <w:b/>
+          <w:bCs/>
+        </w:rPr>
+        <w:t>(17 AL 21 DE NOVEMBRE DE 2025)</w:t>
+      </w:r>
+      <w:bookmarkEnd w:id="44"/>
+      <w:r>
+        <w:rPr>
+          <w:rFonts w:ascii="Arial" w:hAnsi="Arial" w:cs="Arial"/>
+          <w:b/>
+          <w:bCs/>
+        </w:rPr>
+        <w:t xml:space="preserve"> </w:t>
+      </w:r>
+    </w:p>
+    <w:p>
+      <w:pPr>
+        <w:tabs>
+          <w:tab w:val="left" w:pos="1452"/>
+        </w:tabs>
+        <w:spacing w:line="360" w:lineRule="auto"/>
+        <w:rPr>
+          <w:rFonts w:ascii="Arial" w:hAnsi="Arial" w:cs="Arial"/>
+          <w:b/>
+          <w:bCs/>
+        </w:rPr>
+      </w:pPr>
+      <w:bookmarkStart w:id="45" w:name="sexto_lunes"/>
+      <w:r>
+        <w:rPr>
+          <w:rFonts w:ascii="Arial" w:hAnsi="Arial" w:cs="Arial"/>
+          <w:b/>
+          <w:bCs/>
+        </w:rPr>
+        <w:t>Lunes 17</w:t>
+      </w:r>
+      <w:r>
+        <w:rPr>
+          <w:rFonts w:ascii="Arial" w:hAnsi="Arial" w:cs="Arial"/>
+          <w:b/>
+          <w:bCs/>
+        </w:rPr>
+        <w:t>/</w:t>
+      </w:r>
+      <w:r>
+        <w:rPr>
+          <w:rFonts w:ascii="Arial" w:hAnsi="Arial" w:cs="Arial"/>
+          <w:b/>
+          <w:bCs/>
+        </w:rPr>
+        <w:t xml:space="preserve">11 : </w:t>
+      </w:r>
+      <w:r>
+        <w:rPr>
+          <w:rFonts w:ascii="Arial" w:hAnsi="Arial" w:cs="Arial"/>
+          <w:b/>
+          <w:bCs/>
+          <w:color w:val="000000" w:themeColor="text1"/>
+        </w:rPr>
+        <w:t>Resumen</w:t>
+      </w:r>
       <w:bookmarkEnd w:id="45"/>
     </w:p>
     <w:p>
@@ -2564,14 +2895,14 @@
           <w:bCs/>
         </w:rPr>
       </w:pPr>
-      <w:bookmarkStart w:id="46" w:name="quinto_martes"/>
-      <w:r>
-        <w:rPr>
-          <w:rFonts w:ascii="Arial" w:hAnsi="Arial" w:cs="Arial"/>
-          <w:b/>
-          <w:bCs/>
-        </w:rPr>
-        <w:t xml:space="preserve">Martes 11/11: </w:t>
+      <w:bookmarkStart w:id="46" w:name="sexto_martes"/>
+      <w:r>
+        <w:rPr>
+          <w:rFonts w:ascii="Arial" w:hAnsi="Arial" w:cs="Arial"/>
+          <w:b/>
+          <w:bCs/>
+        </w:rPr>
+        <w:t xml:space="preserve">Martes 18/11 : </w:t>
       </w:r>
       <w:r>
         <w:rPr>
@@ -2596,30 +2927,14 @@
           <w:bCs/>
         </w:rPr>
       </w:pPr>
-      <w:bookmarkStart w:id="47" w:name="quinto_miercoles"/>
-      <w:r>
-        <w:rPr>
-          <w:rFonts w:ascii="Arial" w:hAnsi="Arial" w:cs="Arial"/>
-          <w:b/>
-          <w:bCs/>
-        </w:rPr>
-        <w:t>Miérco</w:t>
-      </w:r>
-      <w:r>
-        <w:rPr>
-          <w:rFonts w:ascii="Arial" w:hAnsi="Arial" w:cs="Arial"/>
-          <w:b/>
-          <w:bCs/>
-        </w:rPr>
-        <w:t>les</w:t>
-      </w:r>
-      <w:r>
-        <w:rPr>
-          <w:rFonts w:ascii="Arial" w:hAnsi="Arial" w:cs="Arial"/>
-          <w:b/>
-          <w:bCs/>
-        </w:rPr>
-        <w:t xml:space="preserve"> 12/11: </w:t>
+      <w:bookmarkStart w:id="47" w:name="sexto_miercoles"/>
+      <w:r>
+        <w:rPr>
+          <w:rFonts w:ascii="Arial" w:hAnsi="Arial" w:cs="Arial"/>
+          <w:b/>
+          <w:bCs/>
+        </w:rPr>
+        <w:t xml:space="preserve">Miércoles 19/11: </w:t>
       </w:r>
       <w:r>
         <w:rPr>
@@ -2631,27 +2946,35 @@
         <w:t>Resumen</w:t>
       </w:r>
       <w:bookmarkEnd w:id="47"/>
-    </w:p>
-    <w:p>
-      <w:pPr>
-        <w:tabs>
-          <w:tab w:val="left" w:pos="1452"/>
-        </w:tabs>
-        <w:spacing w:line="360" w:lineRule="auto"/>
-        <w:rPr>
-          <w:rFonts w:ascii="Arial" w:hAnsi="Arial" w:cs="Arial"/>
-          <w:b/>
-          <w:bCs/>
-        </w:rPr>
-      </w:pPr>
-      <w:bookmarkStart w:id="48" w:name="quinto_jueves"/>
-      <w:r>
-        <w:rPr>
-          <w:rFonts w:ascii="Arial" w:hAnsi="Arial" w:cs="Arial"/>
-          <w:b/>
-          <w:bCs/>
-        </w:rPr>
-        <w:t>Jueves 13</w:t>
+      <w:r>
+        <w:rPr>
+          <w:rFonts w:ascii="Arial" w:hAnsi="Arial" w:cs="Arial"/>
+          <w:b/>
+          <w:bCs/>
+        </w:rPr>
+        <w:t xml:space="preserve"> </w:t>
+      </w:r>
+    </w:p>
+    <w:p>
+      <w:pPr>
+        <w:tabs>
+          <w:tab w:val="left" w:pos="1452"/>
+        </w:tabs>
+        <w:spacing w:line="360" w:lineRule="auto"/>
+        <w:rPr>
+          <w:rFonts w:ascii="Arial" w:hAnsi="Arial" w:cs="Arial"/>
+          <w:b/>
+          <w:bCs/>
+        </w:rPr>
+      </w:pPr>
+      <w:bookmarkStart w:id="48" w:name="sexto_jueves"/>
+      <w:r>
+        <w:rPr>
+          <w:rFonts w:ascii="Arial" w:hAnsi="Arial" w:cs="Arial"/>
+          <w:b/>
+          <w:bCs/>
+        </w:rPr>
+        <w:t>Jueves 20</w:t>
       </w:r>
       <w:r>
         <w:rPr>
@@ -2693,14 +3016,14 @@
           <w:color w:val="000000" w:themeColor="text1"/>
         </w:rPr>
       </w:pPr>
-      <w:bookmarkStart w:id="49" w:name="quinto_viernes"/>
-      <w:r>
-        <w:rPr>
-          <w:rFonts w:ascii="Arial" w:hAnsi="Arial" w:cs="Arial"/>
-          <w:b/>
-          <w:bCs/>
-        </w:rPr>
-        <w:t xml:space="preserve">Viernes 14/11: </w:t>
+      <w:bookmarkStart w:id="49" w:name="sexto_viernes"/>
+      <w:r>
+        <w:rPr>
+          <w:rFonts w:ascii="Arial" w:hAnsi="Arial" w:cs="Arial"/>
+          <w:b/>
+          <w:bCs/>
+        </w:rPr>
+        <w:t xml:space="preserve">Viernes 21/11: </w:t>
       </w:r>
       <w:r>
         <w:rPr>
@@ -2726,7 +3049,7 @@
           <w:color w:val="000000" w:themeColor="text1"/>
         </w:rPr>
       </w:pPr>
-      <w:bookmarkStart w:id="50" w:name="quinto_sabado"/>
+      <w:bookmarkStart w:id="50" w:name="sexto_sabado"/>
       <w:r>
         <w:rPr>
           <w:rFonts w:ascii="Arial" w:hAnsi="Arial" w:cs="Arial"/>
@@ -2741,15 +3064,15 @@
           <w:b/>
           <w:bCs/>
         </w:rPr>
-        <w:t xml:space="preserve"> </w:t>
-      </w:r>
-      <w:r>
-        <w:rPr>
-          <w:rFonts w:ascii="Arial" w:hAnsi="Arial" w:cs="Arial"/>
-          <w:b/>
-          <w:bCs/>
-        </w:rPr>
-        <w:t>15</w:t>
+        <w:t xml:space="preserve"> 2</w:t>
+      </w:r>
+      <w:r>
+        <w:rPr>
+          <w:rFonts w:ascii="Arial" w:hAnsi="Arial" w:cs="Arial"/>
+          <w:b/>
+          <w:bCs/>
+        </w:rPr>
+        <w:t>2</w:t>
       </w:r>
       <w:r>
         <w:rPr>
@@ -2769,316 +3092,6 @@
         <w:t>Resumen</w:t>
       </w:r>
       <w:bookmarkEnd w:id="50"/>
-    </w:p>
-    <w:p>
-      <w:pPr>
-        <w:tabs>
-          <w:tab w:val="left" w:pos="1452"/>
-        </w:tabs>
-        <w:spacing w:line="360" w:lineRule="auto"/>
-        <w:rPr>
-          <w:rFonts w:ascii="Arial" w:hAnsi="Arial" w:cs="Arial"/>
-          <w:b/>
-          <w:bCs/>
-        </w:rPr>
-      </w:pPr>
-    </w:p>
-    <w:p>
-      <w:pPr>
-        <w:tabs>
-          <w:tab w:val="left" w:pos="1452"/>
-        </w:tabs>
-        <w:spacing w:line="360" w:lineRule="auto"/>
-        <w:rPr>
-          <w:rFonts w:ascii="Arial" w:hAnsi="Arial" w:cs="Arial"/>
-          <w:b/>
-          <w:bCs/>
-        </w:rPr>
-      </w:pPr>
-      <w:r>
-        <w:rPr>
-          <w:rFonts w:ascii="Arial" w:hAnsi="Arial" w:cs="Arial"/>
-          <w:b/>
-          <w:bCs/>
-        </w:rPr>
-        <w:t xml:space="preserve">SEMANA 6 </w:t>
-      </w:r>
-      <w:bookmarkStart w:id="51" w:name="sexta_semana_fecha"/>
-      <w:r>
-        <w:rPr>
-          <w:rFonts w:ascii="Arial" w:hAnsi="Arial" w:cs="Arial"/>
-          <w:b/>
-          <w:bCs/>
-        </w:rPr>
-        <w:t>(17 AL 21 DE NOVEMBRE DE 2025)</w:t>
-      </w:r>
-      <w:bookmarkEnd w:id="51"/>
-      <w:r>
-        <w:rPr>
-          <w:rFonts w:ascii="Arial" w:hAnsi="Arial" w:cs="Arial"/>
-          <w:b/>
-          <w:bCs/>
-        </w:rPr>
-        <w:t xml:space="preserve"> </w:t>
-      </w:r>
-    </w:p>
-    <w:p>
-      <w:pPr>
-        <w:tabs>
-          <w:tab w:val="left" w:pos="1452"/>
-        </w:tabs>
-        <w:spacing w:line="360" w:lineRule="auto"/>
-        <w:rPr>
-          <w:rFonts w:ascii="Arial" w:hAnsi="Arial" w:cs="Arial"/>
-          <w:b/>
-          <w:bCs/>
-        </w:rPr>
-      </w:pPr>
-      <w:bookmarkStart w:id="52" w:name="sexto_lunes"/>
-      <w:r>
-        <w:rPr>
-          <w:rFonts w:ascii="Arial" w:hAnsi="Arial" w:cs="Arial"/>
-          <w:b/>
-          <w:bCs/>
-        </w:rPr>
-        <w:t>Lunes 17</w:t>
-      </w:r>
-      <w:r>
-        <w:rPr>
-          <w:rFonts w:ascii="Arial" w:hAnsi="Arial" w:cs="Arial"/>
-          <w:b/>
-          <w:bCs/>
-        </w:rPr>
-        <w:t>/</w:t>
-      </w:r>
-      <w:r>
-        <w:rPr>
-          <w:rFonts w:ascii="Arial" w:hAnsi="Arial" w:cs="Arial"/>
-          <w:b/>
-          <w:bCs/>
-        </w:rPr>
-        <w:t xml:space="preserve">11 : </w:t>
-      </w:r>
-      <w:r>
-        <w:rPr>
-          <w:rFonts w:ascii="Arial" w:hAnsi="Arial" w:cs="Arial"/>
-          <w:b/>
-          <w:bCs/>
-          <w:color w:val="000000" w:themeColor="text1"/>
-        </w:rPr>
-        <w:t>Resumen</w:t>
-      </w:r>
-      <w:bookmarkEnd w:id="52"/>
-    </w:p>
-    <w:p>
-      <w:pPr>
-        <w:tabs>
-          <w:tab w:val="left" w:pos="1452"/>
-        </w:tabs>
-        <w:spacing w:line="360" w:lineRule="auto"/>
-        <w:rPr>
-          <w:rFonts w:ascii="Arial" w:hAnsi="Arial" w:cs="Arial"/>
-          <w:b/>
-          <w:bCs/>
-        </w:rPr>
-      </w:pPr>
-      <w:bookmarkStart w:id="53" w:name="sexto_martes"/>
-      <w:r>
-        <w:rPr>
-          <w:rFonts w:ascii="Arial" w:hAnsi="Arial" w:cs="Arial"/>
-          <w:b/>
-          <w:bCs/>
-        </w:rPr>
-        <w:t xml:space="preserve">Martes 18/11 : </w:t>
-      </w:r>
-      <w:r>
-        <w:rPr>
-          <w:rFonts w:ascii="Arial" w:hAnsi="Arial" w:cs="Arial"/>
-          <w:b/>
-          <w:bCs/>
-          <w:color w:val="000000" w:themeColor="text1"/>
-        </w:rPr>
-        <w:t>Resumen</w:t>
-      </w:r>
-      <w:bookmarkEnd w:id="53"/>
-    </w:p>
-    <w:p>
-      <w:pPr>
-        <w:tabs>
-          <w:tab w:val="left" w:pos="1452"/>
-        </w:tabs>
-        <w:spacing w:line="360" w:lineRule="auto"/>
-        <w:rPr>
-          <w:rFonts w:ascii="Arial" w:hAnsi="Arial" w:cs="Arial"/>
-          <w:b/>
-          <w:bCs/>
-        </w:rPr>
-      </w:pPr>
-      <w:bookmarkStart w:id="54" w:name="sexto_miercoles"/>
-      <w:r>
-        <w:rPr>
-          <w:rFonts w:ascii="Arial" w:hAnsi="Arial" w:cs="Arial"/>
-          <w:b/>
-          <w:bCs/>
-        </w:rPr>
-        <w:t xml:space="preserve">Miércoles 19/11: </w:t>
-      </w:r>
-      <w:r>
-        <w:rPr>
-          <w:rFonts w:ascii="Arial" w:hAnsi="Arial" w:cs="Arial"/>
-          <w:b/>
-          <w:bCs/>
-          <w:color w:val="000000" w:themeColor="text1"/>
-        </w:rPr>
-        <w:t>Resumen</w:t>
-      </w:r>
-      <w:bookmarkEnd w:id="54"/>
-      <w:r>
-        <w:rPr>
-          <w:rFonts w:ascii="Arial" w:hAnsi="Arial" w:cs="Arial"/>
-          <w:b/>
-          <w:bCs/>
-        </w:rPr>
-        <w:t xml:space="preserve"> </w:t>
-      </w:r>
-    </w:p>
-    <w:p>
-      <w:pPr>
-        <w:tabs>
-          <w:tab w:val="left" w:pos="1452"/>
-        </w:tabs>
-        <w:spacing w:line="360" w:lineRule="auto"/>
-        <w:rPr>
-          <w:rFonts w:ascii="Arial" w:hAnsi="Arial" w:cs="Arial"/>
-          <w:b/>
-          <w:bCs/>
-        </w:rPr>
-      </w:pPr>
-      <w:bookmarkStart w:id="55" w:name="sexto_jueves"/>
-      <w:r>
-        <w:rPr>
-          <w:rFonts w:ascii="Arial" w:hAnsi="Arial" w:cs="Arial"/>
-          <w:b/>
-          <w:bCs/>
-        </w:rPr>
-        <w:t>Jueves 20</w:t>
-      </w:r>
-      <w:r>
-        <w:rPr>
-          <w:rFonts w:ascii="Arial" w:hAnsi="Arial" w:cs="Arial"/>
-          <w:b/>
-          <w:bCs/>
-        </w:rPr>
-        <w:t>/</w:t>
-      </w:r>
-      <w:r>
-        <w:rPr>
-          <w:rFonts w:ascii="Arial" w:hAnsi="Arial" w:cs="Arial"/>
-          <w:b/>
-          <w:bCs/>
-        </w:rPr>
-        <w:t xml:space="preserve">11: </w:t>
-      </w:r>
-      <w:r>
-        <w:rPr>
-          <w:rFonts w:ascii="Arial" w:hAnsi="Arial" w:cs="Arial"/>
-          <w:b/>
-          <w:bCs/>
-          <w:color w:val="000000" w:themeColor="text1"/>
-        </w:rPr>
-        <w:t>Resumen</w:t>
-      </w:r>
-      <w:bookmarkEnd w:id="55"/>
-    </w:p>
-    <w:p>
-      <w:pPr>
-        <w:tabs>
-          <w:tab w:val="left" w:pos="1452"/>
-        </w:tabs>
-        <w:spacing w:line="360" w:lineRule="auto"/>
-        <w:rPr>
-          <w:rFonts w:ascii="Arial" w:hAnsi="Arial" w:cs="Arial"/>
-          <w:b/>
-          <w:bCs/>
-          <w:color w:val="000000" w:themeColor="text1"/>
-        </w:rPr>
-      </w:pPr>
-      <w:bookmarkStart w:id="56" w:name="sexto_viernes"/>
-      <w:r>
-        <w:rPr>
-          <w:rFonts w:ascii="Arial" w:hAnsi="Arial" w:cs="Arial"/>
-          <w:b/>
-          <w:bCs/>
-        </w:rPr>
-        <w:t xml:space="preserve">Viernes 21/11: </w:t>
-      </w:r>
-      <w:r>
-        <w:rPr>
-          <w:rFonts w:ascii="Arial" w:hAnsi="Arial" w:cs="Arial"/>
-          <w:b/>
-          <w:bCs/>
-          <w:color w:val="000000" w:themeColor="text1"/>
-        </w:rPr>
-        <w:t>Resumen</w:t>
-      </w:r>
-      <w:bookmarkEnd w:id="56"/>
-    </w:p>
-    <w:p>
-      <w:pPr>
-        <w:tabs>
-          <w:tab w:val="left" w:pos="1452"/>
-        </w:tabs>
-        <w:spacing w:line="360" w:lineRule="auto"/>
-        <w:rPr>
-          <w:rFonts w:ascii="Arial" w:hAnsi="Arial" w:cs="Arial"/>
-          <w:b/>
-          <w:bCs/>
-          <w:color w:val="000000" w:themeColor="text1"/>
-        </w:rPr>
-      </w:pPr>
-      <w:bookmarkStart w:id="57" w:name="sexto_sabado"/>
-      <w:r>
-        <w:rPr>
-          <w:rFonts w:ascii="Arial" w:hAnsi="Arial" w:cs="Arial"/>
-          <w:b/>
-          <w:bCs/>
-        </w:rPr>
-        <w:t>Sabado</w:t>
-      </w:r>
-      <w:r>
-        <w:rPr>
-          <w:rFonts w:ascii="Arial" w:hAnsi="Arial" w:cs="Arial"/>
-          <w:b/>
-          <w:bCs/>
-        </w:rPr>
-        <w:t xml:space="preserve"> 2</w:t>
-      </w:r>
-      <w:r>
-        <w:rPr>
-          <w:rFonts w:ascii="Arial" w:hAnsi="Arial" w:cs="Arial"/>
-          <w:b/>
-          <w:bCs/>
-        </w:rPr>
-        <w:t>2</w:t>
-      </w:r>
-      <w:r>
-        <w:rPr>
-          <w:rFonts w:ascii="Arial" w:hAnsi="Arial" w:cs="Arial"/>
-          <w:b/>
-          <w:bCs/>
-        </w:rPr>
-        <w:t xml:space="preserve">/11: </w:t>
-      </w:r>
-      <w:r>
-        <w:rPr>
-          <w:rFonts w:ascii="Arial" w:hAnsi="Arial" w:cs="Arial"/>
-          <w:b/>
-          <w:bCs/>
-          <w:color w:val="000000" w:themeColor="text1"/>
-        </w:rPr>
-        <w:t>Resumen</w:t>
-      </w:r>
-      <w:bookmarkEnd w:id="57"/>
     </w:p>
     <w:p>
       <w:pPr>
@@ -3878,6 +3891,7 @@
   <w:style w:type="character" w:default="1" w:styleId="Fuentedeprrafopredeter">
     <w:name w:val="Default Paragraph Font"/>
     <w:uiPriority w:val="1"/>
+    <w:semiHidden/>
     <w:unhideWhenUsed/>
   </w:style>
   <w:style w:type="table" w:default="1" w:styleId="Tablanormal">

</xml_diff>

<commit_message>
Informe de Pasantía: saca el exceso de párrafos vacíos al final que dejaba una página en blanco
La plantilla tenía 8 párrafos vacíos después de 'CONCLUSIONES' -- el
resto del documento usa como mucho 2 entre una sección y la siguiente
(OBJETIVOS GENERALES, OBJETIVOS ESPECÍFICOS, METAS ALCANZADAS). Con el
texto de relleno de la plantilla (una palabra por día) esto no se
notaba, entraba todo en 4 páginas igual; pero con las descripciones
reales de un alumno (varias líneas por día) ese sobrante alcanza para
empujar 'CONCLUSIONES' a una página aparte, casi vacía, al final del
documento.

Se recortan los últimos 6 párrafos vacíos (quedan 2, mismo criterio que
el resto de las secciones). Verificado con python-docx + LibreOffice:
los 51 bookmarks siguen intactos (ninguno vivía en esos párrafos) y el
documento se sigue abriendo y renderizando bien.
</commit_message>
<xml_diff>
--- a/src/main/resources/plantillas/Informe_Pasantia_Plantilla.docx
+++ b/src/main/resources/plantillas/Informe_Pasantia_Plantilla.docx
@@ -3162,67 +3162,6 @@
           <w:rFonts w:ascii="Arial" w:hAnsi="Arial" w:cs="Arial"/>
           <w:b/>
           <w:bCs/>
-        </w:rPr>
-      </w:pPr>
-    </w:p>
-    <w:p>
-      <w:pPr>
-        <w:tabs>
-          <w:tab w:val="left" w:pos="1452"/>
-        </w:tabs>
-        <w:spacing w:line="360" w:lineRule="auto"/>
-        <w:rPr>
-          <w:rFonts w:ascii="Arial" w:hAnsi="Arial" w:cs="Arial"/>
-        </w:rPr>
-      </w:pPr>
-    </w:p>
-    <w:p>
-      <w:pPr>
-        <w:tabs>
-          <w:tab w:val="left" w:pos="1452"/>
-        </w:tabs>
-        <w:rPr>
-          <w:lang w:val="es-ES"/>
-        </w:rPr>
-      </w:pPr>
-    </w:p>
-    <w:p>
-      <w:pPr>
-        <w:tabs>
-          <w:tab w:val="left" w:pos="1452"/>
-        </w:tabs>
-        <w:rPr>
-          <w:lang w:val="es-ES"/>
-        </w:rPr>
-      </w:pPr>
-    </w:p>
-    <w:p>
-      <w:pPr>
-        <w:tabs>
-          <w:tab w:val="left" w:pos="1452"/>
-        </w:tabs>
-        <w:rPr>
-          <w:lang w:val="es-ES"/>
-        </w:rPr>
-      </w:pPr>
-    </w:p>
-    <w:p>
-      <w:pPr>
-        <w:tabs>
-          <w:tab w:val="left" w:pos="1452"/>
-        </w:tabs>
-        <w:rPr>
-          <w:lang w:val="es-ES"/>
-        </w:rPr>
-      </w:pPr>
-    </w:p>
-    <w:p>
-      <w:pPr>
-        <w:tabs>
-          <w:tab w:val="left" w:pos="1452"/>
-        </w:tabs>
-        <w:rPr>
-          <w:lang w:val="es-ES"/>
         </w:rPr>
       </w:pPr>
     </w:p>

</xml_diff>

<commit_message>
Informe de Pasantía: 'Sección A/B/C' en vez de 'Turno mañana/tarde'
El párrafo de la plantilla decía literalmente 'Turno: Turno' -- la
primera es la etiqueta fija, la segunda es el marcador que
reemplazarDentroDeParrafo encuentra y cambia por el valor real (bookmark
'turno'). Se cambió la etiqueta a 'Sección: ' con python-docx, dejando
intacto el marcador para no romper la búsqueda por texto que ya hace el
código.

El código ahora pasa alumno.getSeccion() directo en vez de
calcularTurno(alumno.getSeccion()) -- ese método adivinaba un turno
mañana/tarde a partir de si la sección era '1ra' (valores viejos del
campo, ya no representan eso). Se saca calcularTurno, que quedó sin uso.

Verificado con python-docx + LibreOffice: el reemplazo simulado da
'Sección: A' en el encabezado, el resto de los campos y los 51
bookmarks quedan intactos.
</commit_message>
<xml_diff>
--- a/src/main/resources/plantillas/Informe_Pasantia_Plantilla.docx
+++ b/src/main/resources/plantillas/Informe_Pasantia_Plantilla.docx
@@ -589,7 +589,7 @@
           <w:sz w:val="28"/>
           <w:szCs w:val="28"/>
         </w:rPr>
-        <w:t>Tu</w:t>
+        <w:t xml:space="preserve">Sección: </w:t>
       </w:r>
       <w:r>
         <w:rPr>
@@ -598,7 +598,6 @@
           <w:sz w:val="28"/>
           <w:szCs w:val="28"/>
         </w:rPr>
-        <w:t>rn</w:t>
       </w:r>
       <w:r>
         <w:rPr>
@@ -607,7 +606,6 @@
           <w:sz w:val="28"/>
           <w:szCs w:val="28"/>
         </w:rPr>
-        <w:t xml:space="preserve">o: </w:t>
       </w:r>
       <w:bookmarkStart w:id="2" w:name="turno"/>
       <w:r>

</xml_diff>